<commit_message>
Update Andmejälgija liitumisleping põhi document
</commit_message>
<xml_diff>
--- a/doc/Andmejälgija liitumisleping põhi.docx
+++ b/doc/Andmejälgija liitumisleping põhi.docx
@@ -1,88 +1,145 @@
 
 <file path=word/document.xml><?xml version="1.0" encoding="utf-8"?>
-<w:document xmlns:wpc="http://schemas.microsoft.com/office/word/2010/wordprocessingCanvas" xmlns:cx="http://schemas.microsoft.com/office/drawing/2014/chartex" xmlns:cx1="http://schemas.microsoft.com/office/drawing/2015/9/8/chartex" xmlns:cx2="http://schemas.microsoft.com/office/drawing/2015/10/21/chartex" xmlns:cx3="http://schemas.microsoft.com/office/drawing/2016/5/9/chartex" xmlns:cx4="http://schemas.microsoft.com/office/drawing/2016/5/10/chartex" xmlns:cx5="http://schemas.microsoft.com/office/drawing/2016/5/11/chartex" xmlns:cx6="http://schemas.microsoft.com/office/drawing/2016/5/12/chartex" xmlns:cx7="http://schemas.microsoft.com/office/drawing/2016/5/13/chartex" xmlns:cx8="http://schemas.microsoft.com/office/drawing/2016/5/14/chartex" xmlns:mc="http://schemas.openxmlformats.org/markup-compatibility/2006" xmlns:aink="http://schemas.microsoft.com/office/drawing/2016/ink" xmlns:am3d="http://schemas.microsoft.com/office/drawing/2017/model3d" xmlns:o="urn:schemas-microsoft-com:office:office" xmlns:oel="http://schemas.microsoft.com/office/2019/extlst" xmlns:r="http://schemas.openxmlformats.org/officeDocument/2006/relationships" xmlns:m="http://schemas.openxmlformats.org/officeDocument/2006/math" xmlns:v="urn:schemas-microsoft-com:vml" xmlns:wp14="http://schemas.microsoft.com/office/word/2010/wordprocessingDrawing" xmlns:wp="http://schemas.openxmlformats.org/drawingml/2006/wordprocessingDrawing" xmlns:w10="urn:schemas-microsoft-com:office:word" xmlns:w="http://schemas.openxmlformats.org/wordprocessingml/2006/main" xmlns:w14="http://schemas.microsoft.com/office/word/2010/wordml" xmlns:w15="http://schemas.microsoft.com/office/word/2012/wordml" xmlns:w16cex="http://schemas.microsoft.com/office/word/2018/wordml/cex" xmlns:w16cid="http://schemas.microsoft.com/office/word/2016/wordml/cid" xmlns:w16="http://schemas.microsoft.com/office/word/2018/wordml" xmlns:w16sdtdh="http://schemas.microsoft.com/office/word/2020/wordml/sdtdatahash" xmlns:w16se="http://schemas.microsoft.com/office/word/2015/wordml/symex" xmlns:wpg="http://schemas.microsoft.com/office/word/2010/wordprocessingGroup" xmlns:wpi="http://schemas.microsoft.com/office/word/2010/wordprocessingInk" xmlns:wne="http://schemas.microsoft.com/office/word/2006/wordml" xmlns:wps="http://schemas.microsoft.com/office/word/2010/wordprocessingShape" mc:Ignorable="w14 w15 w16se w16cid w16 w16cex w16sdtdh wp14">
+<w:document xmlns:wpc="http://schemas.microsoft.com/office/word/2010/wordprocessingCanvas" xmlns:cx="http://schemas.microsoft.com/office/drawing/2014/chartex" xmlns:cx1="http://schemas.microsoft.com/office/drawing/2015/9/8/chartex" xmlns:cx2="http://schemas.microsoft.com/office/drawing/2015/10/21/chartex" xmlns:cx3="http://schemas.microsoft.com/office/drawing/2016/5/9/chartex" xmlns:cx4="http://schemas.microsoft.com/office/drawing/2016/5/10/chartex" xmlns:cx5="http://schemas.microsoft.com/office/drawing/2016/5/11/chartex" xmlns:cx6="http://schemas.microsoft.com/office/drawing/2016/5/12/chartex" xmlns:cx7="http://schemas.microsoft.com/office/drawing/2016/5/13/chartex" xmlns:cx8="http://schemas.microsoft.com/office/drawing/2016/5/14/chartex" xmlns:mc="http://schemas.openxmlformats.org/markup-compatibility/2006" xmlns:aink="http://schemas.microsoft.com/office/drawing/2016/ink" xmlns:am3d="http://schemas.microsoft.com/office/drawing/2017/model3d" xmlns:o="urn:schemas-microsoft-com:office:office" xmlns:oel="http://schemas.microsoft.com/office/2019/extlst" xmlns:r="http://schemas.openxmlformats.org/officeDocument/2006/relationships" xmlns:m="http://schemas.openxmlformats.org/officeDocument/2006/math" xmlns:v="urn:schemas-microsoft-com:vml" xmlns:wp14="http://schemas.microsoft.com/office/word/2010/wordprocessingDrawing" xmlns:wp="http://schemas.openxmlformats.org/drawingml/2006/wordprocessingDrawing" xmlns:w10="urn:schemas-microsoft-com:office:word" xmlns:w="http://schemas.openxmlformats.org/wordprocessingml/2006/main" xmlns:w14="http://schemas.microsoft.com/office/word/2010/wordml" xmlns:w15="http://schemas.microsoft.com/office/word/2012/wordml" xmlns:w16cex="http://schemas.microsoft.com/office/word/2018/wordml/cex" xmlns:w16cid="http://schemas.microsoft.com/office/word/2016/wordml/cid" xmlns:w16="http://schemas.microsoft.com/office/word/2018/wordml" xmlns:w16du="http://schemas.microsoft.com/office/word/2023/wordml/word16du" xmlns:w16sdtdh="http://schemas.microsoft.com/office/word/2020/wordml/sdtdatahash" xmlns:w16sdtfl="http://schemas.microsoft.com/office/word/2024/wordml/sdtformatlock" xmlns:w16se="http://schemas.microsoft.com/office/word/2015/wordml/symex" xmlns:wpg="http://schemas.microsoft.com/office/word/2010/wordprocessingGroup" xmlns:wpi="http://schemas.microsoft.com/office/word/2010/wordprocessingInk" xmlns:wne="http://schemas.microsoft.com/office/word/2006/wordml" xmlns:wps="http://schemas.microsoft.com/office/word/2010/wordprocessingShape" mc:Ignorable="w14 w15 w16se w16cid w16 w16cex w16sdtdh w16sdtfl w16du wp14">
   <w:body>
-    <w:tbl>
-      <w:tblPr>
-        <w:tblW w:w="5152" w:type="dxa"/>
-        <w:tblLayout w:type="fixed"/>
-        <w:tblCellMar>
-          <w:left w:w="0" w:type="dxa"/>
-          <w:right w:w="0" w:type="dxa"/>
-        </w:tblCellMar>
-        <w:tblLook w:val="0000" w:firstRow="0" w:lastRow="0" w:firstColumn="0" w:lastColumn="0" w:noHBand="0" w:noVBand="0"/>
-      </w:tblPr>
-      <w:tblGrid>
-        <w:gridCol w:w="5152"/>
-      </w:tblGrid>
-      <w:tr>
-        <w:trPr>
-          <w:trHeight w:hRule="exact" w:val="1758"/>
-        </w:trPr>
-        <w:tc>
-          <w:tcPr>
-            <w:tcW w:w="5152" w:type="dxa"/>
-            <w:shd w:val="clear" w:color="auto" w:fill="auto"/>
-          </w:tcPr>
-          <w:p>
-            <w:pPr>
-              <w:pStyle w:val="TableContents"/>
-              <w:rPr>
-                <w:b/>
-              </w:rPr>
-            </w:pPr>
-            <w:r>
-              <w:rPr>
-                <w:b/>
-                <w:noProof/>
-                <w:lang w:val="en-GB" w:eastAsia="en-GB" w:bidi="ar-SA"/>
-              </w:rPr>
-              <w:drawing>
-                <wp:inline distT="0" distB="0" distL="0" distR="0" wp14:anchorId="0484A677" wp14:editId="6FF2C8D8">
-                  <wp:extent cx="3330575" cy="1082675"/>
-                  <wp:effectExtent l="0" t="0" r="0" b="0"/>
-                  <wp:docPr id="2" name="Pilt 2"/>
-                  <wp:cNvGraphicFramePr>
-                    <a:graphicFrameLocks xmlns:a="http://schemas.openxmlformats.org/drawingml/2006/main" noChangeAspect="1"/>
-                  </wp:cNvGraphicFramePr>
-                  <a:graphic xmlns:a="http://schemas.openxmlformats.org/drawingml/2006/main">
-                    <a:graphicData uri="http://schemas.openxmlformats.org/drawingml/2006/picture">
-                      <pic:pic xmlns:pic="http://schemas.openxmlformats.org/drawingml/2006/picture">
-                        <pic:nvPicPr>
-                          <pic:cNvPr id="0" name="logo.png"/>
-                          <pic:cNvPicPr/>
-                        </pic:nvPicPr>
-                        <pic:blipFill>
-                          <a:blip r:embed="rId8" cstate="print">
-                            <a:extLst>
-                              <a:ext uri="{28A0092B-C50C-407E-A947-70E740481C1C}">
-                                <a14:useLocalDpi xmlns:a14="http://schemas.microsoft.com/office/drawing/2010/main" val="0"/>
-                              </a:ext>
-                            </a:extLst>
-                          </a:blip>
-                          <a:stretch>
-                            <a:fillRect/>
-                          </a:stretch>
-                        </pic:blipFill>
-                        <pic:spPr>
-                          <a:xfrm>
-                            <a:off x="0" y="0"/>
-                            <a:ext cx="3330575" cy="1082675"/>
-                          </a:xfrm>
-                          <a:prstGeom prst="rect">
-                            <a:avLst/>
-                          </a:prstGeom>
-                        </pic:spPr>
-                      </pic:pic>
-                    </a:graphicData>
-                  </a:graphic>
-                </wp:inline>
-              </w:drawing>
-            </w:r>
-          </w:p>
-        </w:tc>
-      </w:tr>
-    </w:tbl>
+    <w:p>
+      <w:pPr>
+        <w:tabs>
+          <w:tab w:val="left" w:pos="5529"/>
+          <w:tab w:val="left" w:pos="6237"/>
+        </w:tabs>
+        <w:spacing w:line="240" w:lineRule="auto"/>
+        <w:ind w:left="5529"/>
+        <w:rPr>
+          <w:sz w:val="18"/>
+          <w:szCs w:val="18"/>
+        </w:rPr>
+      </w:pPr>
+      <w:r>
+        <w:rPr>
+          <w:sz w:val="18"/>
+          <w:szCs w:val="18"/>
+        </w:rPr>
+        <w:t xml:space="preserve">   </w:t>
+      </w:r>
+      <w:r>
+        <w:rPr>
+          <w:sz w:val="18"/>
+          <w:szCs w:val="18"/>
+        </w:rPr>
+        <w:t>ASUTUSESISESEKS KASUTAMISEKS</w:t>
+      </w:r>
+    </w:p>
+    <w:p>
+      <w:pPr>
+        <w:tabs>
+          <w:tab w:val="left" w:pos="5670"/>
+          <w:tab w:val="left" w:pos="5954"/>
+        </w:tabs>
+        <w:spacing w:line="240" w:lineRule="auto"/>
+        <w:ind w:left="708" w:firstLine="708"/>
+        <w:rPr>
+          <w:sz w:val="18"/>
+          <w:szCs w:val="18"/>
+        </w:rPr>
+      </w:pPr>
+      <w:r>
+        <w:rPr>
+          <w:sz w:val="18"/>
+          <w:szCs w:val="18"/>
+        </w:rPr>
+        <w:tab/>
+        <w:t xml:space="preserve">Märge tehtud: </w:t>
+      </w:r>
+      <w:r>
+        <w:rPr>
+          <w:sz w:val="18"/>
+          <w:szCs w:val="18"/>
+          <w:highlight w:val="yellow"/>
+        </w:rPr>
+        <w:t>06.05.2026</w:t>
+      </w:r>
+    </w:p>
+    <w:p>
+      <w:pPr>
+        <w:tabs>
+          <w:tab w:val="left" w:pos="5670"/>
+          <w:tab w:val="left" w:pos="5954"/>
+        </w:tabs>
+        <w:spacing w:line="240" w:lineRule="auto"/>
+        <w:ind w:left="708" w:firstLine="708"/>
+        <w:rPr>
+          <w:sz w:val="18"/>
+          <w:szCs w:val="18"/>
+        </w:rPr>
+      </w:pPr>
+      <w:r>
+        <w:rPr>
+          <w:sz w:val="18"/>
+          <w:szCs w:val="18"/>
+        </w:rPr>
+        <w:tab/>
+        <w:t xml:space="preserve">Kehtib kuni: </w:t>
+      </w:r>
+      <w:r>
+        <w:rPr>
+          <w:sz w:val="18"/>
+          <w:szCs w:val="18"/>
+          <w:highlight w:val="yellow"/>
+        </w:rPr>
+        <w:t>06.05.2031</w:t>
+      </w:r>
+    </w:p>
+    <w:p>
+      <w:pPr>
+        <w:tabs>
+          <w:tab w:val="left" w:pos="5670"/>
+        </w:tabs>
+        <w:spacing w:line="240" w:lineRule="auto"/>
+        <w:ind w:left="708" w:firstLine="708"/>
+        <w:rPr>
+          <w:sz w:val="18"/>
+          <w:szCs w:val="18"/>
+        </w:rPr>
+      </w:pPr>
+      <w:r>
+        <w:rPr>
+          <w:sz w:val="18"/>
+          <w:szCs w:val="18"/>
+        </w:rPr>
+        <w:tab/>
+        <w:t xml:space="preserve">Alus: </w:t>
+      </w:r>
+      <w:r>
+        <w:rPr>
+          <w:sz w:val="18"/>
+          <w:szCs w:val="18"/>
+        </w:rPr>
+        <w:t>AvTS § 35 lg 1 p 9</w:t>
+      </w:r>
+    </w:p>
+    <w:p>
+      <w:pPr>
+        <w:tabs>
+          <w:tab w:val="left" w:pos="5670"/>
+          <w:tab w:val="left" w:pos="5954"/>
+        </w:tabs>
+        <w:spacing w:line="240" w:lineRule="auto"/>
+        <w:ind w:firstLine="708"/>
+        <w:rPr>
+          <w:sz w:val="18"/>
+          <w:szCs w:val="18"/>
+        </w:rPr>
+      </w:pPr>
+      <w:r>
+        <w:rPr>
+          <w:sz w:val="18"/>
+          <w:szCs w:val="18"/>
+        </w:rPr>
+        <w:tab/>
+        <w:t>Teabevaldaja: Riigi Infosüsteemi Amet</w:t>
+      </w:r>
+    </w:p>
     <w:p>
       <w:pPr>
         <w:spacing w:line="240" w:lineRule="auto"/>
@@ -91,12 +148,59 @@
           <w:b/>
         </w:rPr>
       </w:pPr>
-      <w:r>
+    </w:p>
+    <w:p>
+      <w:pPr>
+        <w:spacing w:line="240" w:lineRule="auto"/>
+        <w:jc w:val="center"/>
         <w:rPr>
           <w:b/>
         </w:rPr>
+      </w:pPr>
+    </w:p>
+    <w:p>
+      <w:pPr>
+        <w:spacing w:line="240" w:lineRule="auto"/>
+        <w:jc w:val="left"/>
+        <w:rPr>
+          <w:b/>
+        </w:rPr>
+      </w:pPr>
+      <w:r>
+        <w:rPr>
+          <w:b/>
+        </w:rPr>
         <w:t>ANDMETÖÖTLUSLEPING</w:t>
       </w:r>
+      <w:r>
+        <w:rPr>
+          <w:b/>
+        </w:rPr>
+        <w:t xml:space="preserve"> </w:t>
+      </w:r>
+      <w:r>
+        <w:rPr>
+          <w:b/>
+          <w:highlight w:val="yellow"/>
+        </w:rPr>
+        <w:t xml:space="preserve">nr </w:t>
+      </w:r>
+      <w:r>
+        <w:rPr>
+          <w:b/>
+          <w:highlight w:val="yellow"/>
+        </w:rPr>
+        <w:t>4.2-17/….</w:t>
+      </w:r>
+    </w:p>
+    <w:p>
+      <w:pPr>
+        <w:spacing w:line="240" w:lineRule="auto"/>
+        <w:jc w:val="left"/>
+        <w:rPr>
+          <w:b/>
+        </w:rPr>
+      </w:pPr>
     </w:p>
     <w:p>
       <w:pPr>
@@ -170,7 +274,7 @@
       <w:r>
         <w:rPr>
           <w:rFonts w:ascii="Times New Roman" w:hAnsi="Times New Roman" w:cs="Times New Roman"/>
-          <w:i/>
+          <w:iCs/>
           <w:sz w:val="24"/>
           <w:szCs w:val="24"/>
         </w:rPr>
@@ -192,7 +296,7 @@
           <w:szCs w:val="24"/>
           <w:highlight w:val="yellow"/>
         </w:rPr>
-        <w:t>[…]</w:t>
+        <w:t>[</w:t>
       </w:r>
       <w:r>
         <w:rPr>
@@ -200,8 +304,27 @@
           <w:color w:val="000000" w:themeColor="text1"/>
           <w:sz w:val="24"/>
           <w:szCs w:val="24"/>
-        </w:rPr>
-        <w:t xml:space="preserve">  </w:t>
+          <w:highlight w:val="yellow"/>
+        </w:rPr>
+        <w:t>asutus</w:t>
+      </w:r>
+      <w:r>
+        <w:rPr>
+          <w:rFonts w:ascii="Times New Roman" w:hAnsi="Times New Roman" w:cs="Times New Roman"/>
+          <w:color w:val="000000" w:themeColor="text1"/>
+          <w:sz w:val="24"/>
+          <w:szCs w:val="24"/>
+        </w:rPr>
+        <w:t>]</w:t>
+      </w:r>
+      <w:r>
+        <w:rPr>
+          <w:rFonts w:ascii="Times New Roman" w:hAnsi="Times New Roman" w:cs="Times New Roman"/>
+          <w:color w:val="000000" w:themeColor="text1"/>
+          <w:sz w:val="24"/>
+          <w:szCs w:val="24"/>
+        </w:rPr>
+        <w:t xml:space="preserve"> </w:t>
       </w:r>
       <w:r>
         <w:rPr>
@@ -269,7 +392,7 @@
       <w:r>
         <w:rPr>
           <w:rFonts w:ascii="Times New Roman" w:hAnsi="Times New Roman" w:cs="Times New Roman"/>
-          <w:i/>
+          <w:iCs/>
           <w:sz w:val="24"/>
           <w:szCs w:val="24"/>
         </w:rPr>
@@ -359,27 +482,7 @@
           <w:sz w:val="24"/>
           <w:szCs w:val="24"/>
         </w:rPr>
-        <w:t xml:space="preserve">Isikuandmete töötlemisel kohustuvad pooled juhinduma kehtivatest õigusaktidest, sealhulgas avaliku teabe seadusest ning Euroopa Parlamendi ja nõukogu 27. aprill 2016. a määrusest (EL) 2016/679 füüsiliste isikute kaitse kohta isikuandmete töötlemisel ja selliste andmete vaba liikumise ning direktiivi 95/46/EÜ kehtetuks tunnistamise kohta (isikuandmete kaitse </w:t>
-      </w:r>
-      <w:proofErr w:type="spellStart"/>
-      <w:r>
-        <w:rPr>
-          <w:rFonts w:ascii="Times New Roman" w:hAnsi="Times New Roman" w:cs="Times New Roman"/>
-          <w:color w:val="000000"/>
-          <w:sz w:val="24"/>
-          <w:szCs w:val="24"/>
-        </w:rPr>
-        <w:t>üldmäärus</w:t>
-      </w:r>
-      <w:proofErr w:type="spellEnd"/>
-      <w:r>
-        <w:rPr>
-          <w:rFonts w:ascii="Times New Roman" w:hAnsi="Times New Roman" w:cs="Times New Roman"/>
-          <w:color w:val="000000"/>
-          <w:sz w:val="24"/>
-          <w:szCs w:val="24"/>
-        </w:rPr>
-        <w:t>) ja isikuandmete kaitse seadusest.</w:t>
+        <w:t>Isikuandmete töötlemisel kohustuvad pooled juhinduma kehtivatest õigusaktidest, sealhulgas avaliku teabe seadusest ning Euroopa Parlamendi ja nõukogu 27. aprill 2016. a määrusest (EL) 2016/679 füüsiliste isikute kaitse kohta isikuandmete töötlemisel ja selliste andmete vaba liikumise ning direktiivi 95/46/EÜ kehtetuks tunnistamise kohta (isikuandmete kaitse üldmäärus) ja isikuandmete kaitse seadusest.</w:t>
       </w:r>
     </w:p>
     <w:p>
@@ -479,7 +582,43 @@
           <w:sz w:val="24"/>
           <w:szCs w:val="24"/>
         </w:rPr>
-        <w:t>Vastutav töötleja on kohustatud tagama, et teenuse kasutamisega seotud isikuandmete töötlemiseks on kohaldatava õiguse kohaselt õiguslik alus ja isikuandmete töötlemine toimub õigustatud eesmärkidel.</w:t>
+        <w:t xml:space="preserve">Andmesubjekti päringule tema isikuandmete töötlemise kohta vastab Riigiportaali päringu teinud asutus või ettevõte. </w:t>
+      </w:r>
+    </w:p>
+    <w:p>
+      <w:pPr>
+        <w:pStyle w:val="ListParagraph"/>
+        <w:jc w:val="both"/>
+        <w:rPr>
+          <w:rFonts w:ascii="Times New Roman" w:hAnsi="Times New Roman" w:cs="Times New Roman"/>
+          <w:sz w:val="24"/>
+          <w:szCs w:val="24"/>
+        </w:rPr>
+      </w:pPr>
+    </w:p>
+    <w:p>
+      <w:pPr>
+        <w:pStyle w:val="ListParagraph"/>
+        <w:numPr>
+          <w:ilvl w:val="1"/>
+          <w:numId w:val="15"/>
+        </w:numPr>
+        <w:jc w:val="both"/>
+        <w:rPr>
+          <w:rFonts w:ascii="Times New Roman" w:hAnsi="Times New Roman" w:cs="Times New Roman"/>
+          <w:sz w:val="24"/>
+          <w:szCs w:val="24"/>
+          <w:u w:val="single"/>
+        </w:rPr>
+      </w:pPr>
+      <w:r>
+        <w:rPr>
+          <w:rFonts w:ascii="Times New Roman" w:hAnsi="Times New Roman" w:cs="Times New Roman"/>
+          <w:sz w:val="24"/>
+          <w:szCs w:val="24"/>
+          <w:u w:val="single"/>
+        </w:rPr>
+        <w:t>Volitatud töötleja kohustused</w:t>
       </w:r>
     </w:p>
     <w:p>
@@ -502,12 +641,16 @@
           <w:sz w:val="24"/>
           <w:szCs w:val="24"/>
         </w:rPr>
-        <w:t xml:space="preserve">Andmesubjekti päringule tema isikuandmete töötlemise kohta vastab Riigiportaali päringu teinud asutus või ettevõte. </w:t>
+        <w:t>Volitatud töötleja on kohustatud rakendama teenuse osutamisel isikuandmete turvalisuse tagamiseks asjakohaseid tehnilisi ja korralduslikke meetmeid, hõlmates muu hulgas vastavalt vajadusele järgmist: isikuandmete pseudonümiseerimine ja krüpteerimine; võime tagada isikuandmeid töötlevate süsteemide ja teenuste kasutamisel kogutud isikuandmete kestev konfidentsiaalsus, terviklus, kättesaadavus ja vastupidavus; võime taastada õigeaegselt isikuandmete kättesaadavus ja juurdepääs andmetele füüsilise või tehnilise vahejuhtumi korral; tehniliste ja korralduslike meetmete tõhususe korrapärase testimise ja hindamise kord isikuandmete töötlemise turvalisuse tagamiseks vastavalt Riigiportaali teenustaseme tingimustes toodule.</w:t>
       </w:r>
     </w:p>
     <w:p>
       <w:pPr>
         <w:pStyle w:val="ListParagraph"/>
+        <w:numPr>
+          <w:ilvl w:val="2"/>
+          <w:numId w:val="15"/>
+        </w:numPr>
         <w:jc w:val="both"/>
         <w:rPr>
           <w:rFonts w:ascii="Times New Roman" w:hAnsi="Times New Roman" w:cs="Times New Roman"/>
@@ -515,6 +658,172 @@
           <w:szCs w:val="24"/>
         </w:rPr>
       </w:pPr>
+      <w:r>
+        <w:rPr>
+          <w:rFonts w:ascii="Times New Roman" w:hAnsi="Times New Roman" w:cs="Times New Roman"/>
+          <w:sz w:val="24"/>
+          <w:szCs w:val="24"/>
+        </w:rPr>
+        <w:t xml:space="preserve">Volitatud töötleja teeb kõik endast sõltuva, et kaitsta töödeldavaid isikuandmeid loata või ebaseadusliku töötlemise ning juhusliku kaotamise, hävitamise või avalikustamise eest. </w:t>
+      </w:r>
+    </w:p>
+    <w:p>
+      <w:pPr>
+        <w:pStyle w:val="ListParagraph"/>
+        <w:numPr>
+          <w:ilvl w:val="2"/>
+          <w:numId w:val="15"/>
+        </w:numPr>
+        <w:jc w:val="both"/>
+        <w:rPr>
+          <w:rFonts w:ascii="Times New Roman" w:hAnsi="Times New Roman" w:cs="Times New Roman"/>
+          <w:sz w:val="24"/>
+          <w:szCs w:val="24"/>
+        </w:rPr>
+      </w:pPr>
+      <w:r>
+        <w:rPr>
+          <w:rFonts w:ascii="Times New Roman" w:hAnsi="Times New Roman" w:cs="Times New Roman"/>
+          <w:sz w:val="24"/>
+          <w:szCs w:val="24"/>
+        </w:rPr>
+        <w:t>Kui volitatud töötleja kahtleb vastutava töötleja poolt määratud tehniliste ja korralduslike meetmete asjakohasuses ja piisavuses, teatab ta sellest viivitamatult vastutavale töötlejale.</w:t>
+      </w:r>
+    </w:p>
+    <w:p>
+      <w:pPr>
+        <w:pStyle w:val="ListParagraph"/>
+        <w:numPr>
+          <w:ilvl w:val="2"/>
+          <w:numId w:val="15"/>
+        </w:numPr>
+        <w:jc w:val="both"/>
+        <w:rPr>
+          <w:rFonts w:ascii="Times New Roman" w:hAnsi="Times New Roman" w:cs="Times New Roman"/>
+          <w:sz w:val="24"/>
+          <w:szCs w:val="24"/>
+        </w:rPr>
+      </w:pPr>
+      <w:r>
+        <w:rPr>
+          <w:rFonts w:ascii="Times New Roman" w:hAnsi="Times New Roman" w:cs="Times New Roman"/>
+          <w:sz w:val="24"/>
+          <w:szCs w:val="24"/>
+        </w:rPr>
+        <w:t xml:space="preserve">Volitatud töötleja tagab tehniliste ja korralduslike meetmete rakendamise valmisoleku enne isikuandmete töötlemisega alustamist. </w:t>
+      </w:r>
+    </w:p>
+    <w:p>
+      <w:pPr>
+        <w:pStyle w:val="ListParagraph"/>
+        <w:numPr>
+          <w:ilvl w:val="2"/>
+          <w:numId w:val="15"/>
+        </w:numPr>
+        <w:jc w:val="both"/>
+        <w:rPr>
+          <w:rFonts w:ascii="Times New Roman" w:hAnsi="Times New Roman" w:cs="Times New Roman"/>
+          <w:sz w:val="24"/>
+          <w:szCs w:val="24"/>
+        </w:rPr>
+      </w:pPr>
+      <w:r>
+        <w:rPr>
+          <w:rFonts w:ascii="Times New Roman" w:hAnsi="Times New Roman" w:cs="Times New Roman"/>
+          <w:sz w:val="24"/>
+          <w:szCs w:val="24"/>
+        </w:rPr>
+        <w:t xml:space="preserve">Volitatud töötlejal ei ole õigust töödelda teenuse osutamisel andmesubjekti isikuandmeid oma või mis tahes muudel eesmärkidel kui need, mis on sätestatud käesolevas ATL-is. </w:t>
+      </w:r>
+    </w:p>
+    <w:p>
+      <w:pPr>
+        <w:pStyle w:val="ListParagraph"/>
+        <w:numPr>
+          <w:ilvl w:val="2"/>
+          <w:numId w:val="15"/>
+        </w:numPr>
+        <w:jc w:val="both"/>
+        <w:rPr>
+          <w:rFonts w:ascii="Times New Roman" w:hAnsi="Times New Roman" w:cs="Times New Roman"/>
+          <w:sz w:val="24"/>
+          <w:szCs w:val="24"/>
+        </w:rPr>
+      </w:pPr>
+      <w:r>
+        <w:rPr>
+          <w:rFonts w:ascii="Times New Roman" w:hAnsi="Times New Roman" w:cs="Times New Roman"/>
+          <w:sz w:val="24"/>
+          <w:szCs w:val="24"/>
+        </w:rPr>
+        <w:lastRenderedPageBreak/>
+        <w:t xml:space="preserve">Teenuse osutamisel aset leidnud isikuandmete töötlemise rikkumise korral teavitab </w:t>
+      </w:r>
+      <w:r>
+        <w:rPr>
+          <w:rFonts w:ascii="Times New Roman" w:hAnsi="Times New Roman" w:cs="Times New Roman"/>
+          <w:sz w:val="24"/>
+          <w:szCs w:val="24"/>
+        </w:rPr>
+        <w:t xml:space="preserve">volitatud töötleja sellest viivitamatult vastutavat töötlejat </w:t>
+      </w:r>
+      <w:r>
+        <w:rPr>
+          <w:rFonts w:ascii="Times New Roman" w:hAnsi="Times New Roman" w:cs="Times New Roman"/>
+          <w:sz w:val="24"/>
+          <w:szCs w:val="24"/>
+          <w:highlight w:val="yellow"/>
+        </w:rPr>
+        <w:t>e-posti aadressil</w:t>
+      </w:r>
+      <w:r>
+        <w:rPr>
+          <w:rFonts w:ascii="Times New Roman" w:hAnsi="Times New Roman" w:cs="Times New Roman"/>
+          <w:sz w:val="24"/>
+          <w:szCs w:val="24"/>
+          <w:highlight w:val="yellow"/>
+        </w:rPr>
+        <w:t xml:space="preserve"> </w:t>
+      </w:r>
+      <w:r>
+        <w:rPr>
+          <w:highlight w:val="yellow"/>
+        </w:rPr>
+        <w:t>[…..]</w:t>
+      </w:r>
+      <w:r>
+        <w:rPr>
+          <w:rFonts w:ascii="Times New Roman" w:hAnsi="Times New Roman" w:cs="Times New Roman"/>
+          <w:sz w:val="24"/>
+          <w:szCs w:val="24"/>
+          <w:highlight w:val="yellow"/>
+        </w:rPr>
+        <w:t>.</w:t>
+      </w:r>
+      <w:r>
+        <w:rPr>
+          <w:rFonts w:ascii="Times New Roman" w:hAnsi="Times New Roman" w:cs="Times New Roman"/>
+          <w:sz w:val="24"/>
+          <w:szCs w:val="24"/>
+        </w:rPr>
+        <w:t xml:space="preserve"> </w:t>
+      </w:r>
+      <w:r>
+        <w:rPr>
+          <w:rFonts w:ascii="Times New Roman" w:hAnsi="Times New Roman" w:cs="Times New Roman"/>
+          <w:sz w:val="24"/>
+          <w:szCs w:val="24"/>
+        </w:rPr>
+        <w:t>Teates annab volitatud töötleja vastutavale töötlejale teavet asjaoludest,</w:t>
+      </w:r>
+      <w:r>
+        <w:rPr>
+          <w:rFonts w:ascii="Times New Roman" w:hAnsi="Times New Roman" w:cs="Times New Roman"/>
+          <w:sz w:val="24"/>
+          <w:szCs w:val="24"/>
+        </w:rPr>
+        <w:t xml:space="preserve"> mis on põhjustanud isikuandmetega seotud rikkumise, ning ükskõik mis muust isikuandmete vastutava töötleja poolt mõistlikult nõutud seonduvast teabest, mis isikuandmete volitatud töötlejale kättesaadav on.</w:t>
+      </w:r>
     </w:p>
     <w:p>
       <w:pPr>
@@ -528,209 +837,15 @@
           <w:rFonts w:ascii="Times New Roman" w:hAnsi="Times New Roman" w:cs="Times New Roman"/>
           <w:sz w:val="24"/>
           <w:szCs w:val="24"/>
-          <w:u w:val="single"/>
-        </w:rPr>
-      </w:pPr>
-      <w:r>
-        <w:rPr>
-          <w:rFonts w:ascii="Times New Roman" w:hAnsi="Times New Roman" w:cs="Times New Roman"/>
-          <w:sz w:val="24"/>
-          <w:szCs w:val="24"/>
-          <w:u w:val="single"/>
-        </w:rPr>
-        <w:t>Volitatud töötleja kohustused</w:t>
-      </w:r>
-    </w:p>
-    <w:p>
-      <w:pPr>
-        <w:pStyle w:val="ListParagraph"/>
-        <w:numPr>
-          <w:ilvl w:val="2"/>
-          <w:numId w:val="15"/>
-        </w:numPr>
-        <w:jc w:val="both"/>
-        <w:rPr>
-          <w:rFonts w:ascii="Times New Roman" w:hAnsi="Times New Roman" w:cs="Times New Roman"/>
-          <w:sz w:val="24"/>
-          <w:szCs w:val="24"/>
-        </w:rPr>
-      </w:pPr>
-      <w:r>
-        <w:rPr>
-          <w:rFonts w:ascii="Times New Roman" w:hAnsi="Times New Roman" w:cs="Times New Roman"/>
-          <w:sz w:val="24"/>
-          <w:szCs w:val="24"/>
-        </w:rPr>
-        <w:t xml:space="preserve">Volitatud töötleja on kohustatud rakendama teenuse osutamisel isikuandmete turvalisuse tagamiseks asjakohaseid tehnilisi ja korralduslikke meetmeid, hõlmates muu hulgas vastavalt vajadusele järgmist: isikuandmete </w:t>
-      </w:r>
-      <w:proofErr w:type="spellStart"/>
-      <w:r>
-        <w:rPr>
-          <w:rFonts w:ascii="Times New Roman" w:hAnsi="Times New Roman" w:cs="Times New Roman"/>
-          <w:sz w:val="24"/>
-          <w:szCs w:val="24"/>
-        </w:rPr>
-        <w:t>pseudonümiseerimine</w:t>
-      </w:r>
-      <w:proofErr w:type="spellEnd"/>
-      <w:r>
-        <w:rPr>
-          <w:rFonts w:ascii="Times New Roman" w:hAnsi="Times New Roman" w:cs="Times New Roman"/>
-          <w:sz w:val="24"/>
-          <w:szCs w:val="24"/>
-        </w:rPr>
-        <w:t xml:space="preserve"> ja krüpteerimine; võime tagada isikuandmeid töötlevate süsteemide ja teenuste kasutamisel kogutud isikuandmete kestev konfidentsiaalsus, terviklus, kättesaadavus ja vastupidavus; võime taastada õigeaegselt isikuandmete kättesaadavus ja juurdepääs andmetele füüsilise või tehnilise vahejuhtumi korral; tehniliste ja korralduslike meetmete tõhususe korrapärase testimise ja hindamise kord isikuandmete töötlemise turvalisuse tagamiseks vastavalt Riigiportaali teenustaseme tingimustes toodule.</w:t>
-      </w:r>
-    </w:p>
-    <w:p>
-      <w:pPr>
-        <w:pStyle w:val="ListParagraph"/>
-        <w:numPr>
-          <w:ilvl w:val="2"/>
-          <w:numId w:val="15"/>
-        </w:numPr>
-        <w:jc w:val="both"/>
-        <w:rPr>
-          <w:rFonts w:ascii="Times New Roman" w:hAnsi="Times New Roman" w:cs="Times New Roman"/>
-          <w:sz w:val="24"/>
-          <w:szCs w:val="24"/>
-        </w:rPr>
-      </w:pPr>
-      <w:r>
-        <w:rPr>
-          <w:rFonts w:ascii="Times New Roman" w:hAnsi="Times New Roman" w:cs="Times New Roman"/>
-          <w:sz w:val="24"/>
-          <w:szCs w:val="24"/>
-        </w:rPr>
-        <w:t xml:space="preserve">Volitatud töötleja teeb kõik endast sõltuva, et kaitsta töödeldavaid isikuandmeid loata või ebaseadusliku töötlemise ning juhusliku kaotamise, hävitamise või avalikustamise eest. </w:t>
-      </w:r>
-    </w:p>
-    <w:p>
-      <w:pPr>
-        <w:pStyle w:val="ListParagraph"/>
-        <w:numPr>
-          <w:ilvl w:val="2"/>
-          <w:numId w:val="15"/>
-        </w:numPr>
-        <w:jc w:val="both"/>
-        <w:rPr>
-          <w:rFonts w:ascii="Times New Roman" w:hAnsi="Times New Roman" w:cs="Times New Roman"/>
-          <w:sz w:val="24"/>
-          <w:szCs w:val="24"/>
-        </w:rPr>
-      </w:pPr>
-      <w:r>
-        <w:rPr>
-          <w:rFonts w:ascii="Times New Roman" w:hAnsi="Times New Roman" w:cs="Times New Roman"/>
-          <w:sz w:val="24"/>
-          <w:szCs w:val="24"/>
-        </w:rPr>
-        <w:t>Kui volitatud töötleja kahtleb vastutava töötleja poolt määratud tehniliste ja korralduslike meetmete asjakohasuses ja piisavuses, teatab ta sellest viivitamatult vastutavale töötlejale.</w:t>
-      </w:r>
-    </w:p>
-    <w:p>
-      <w:pPr>
-        <w:pStyle w:val="ListParagraph"/>
-        <w:numPr>
-          <w:ilvl w:val="2"/>
-          <w:numId w:val="15"/>
-        </w:numPr>
-        <w:jc w:val="both"/>
-        <w:rPr>
-          <w:rFonts w:ascii="Times New Roman" w:hAnsi="Times New Roman" w:cs="Times New Roman"/>
-          <w:sz w:val="24"/>
-          <w:szCs w:val="24"/>
-        </w:rPr>
-      </w:pPr>
-      <w:r>
-        <w:rPr>
-          <w:rFonts w:ascii="Times New Roman" w:hAnsi="Times New Roman" w:cs="Times New Roman"/>
-          <w:sz w:val="24"/>
-          <w:szCs w:val="24"/>
-        </w:rPr>
-        <w:t xml:space="preserve">Volitatud töötleja tagab tehniliste ja korralduslike meetmete rakendamise valmisoleku enne isikuandmete töötlemisega alustamist. </w:t>
-      </w:r>
-    </w:p>
-    <w:p>
-      <w:pPr>
-        <w:pStyle w:val="ListParagraph"/>
-        <w:numPr>
-          <w:ilvl w:val="2"/>
-          <w:numId w:val="15"/>
-        </w:numPr>
-        <w:jc w:val="both"/>
-        <w:rPr>
-          <w:rFonts w:ascii="Times New Roman" w:hAnsi="Times New Roman" w:cs="Times New Roman"/>
-          <w:sz w:val="24"/>
-          <w:szCs w:val="24"/>
-        </w:rPr>
-      </w:pPr>
-      <w:r>
-        <w:rPr>
-          <w:rFonts w:ascii="Times New Roman" w:hAnsi="Times New Roman" w:cs="Times New Roman"/>
-          <w:sz w:val="24"/>
-          <w:szCs w:val="24"/>
-        </w:rPr>
-        <w:lastRenderedPageBreak/>
-        <w:t xml:space="preserve">Volitatud töötlejal ei ole õigust töödelda teenuse osutamisel andmesubjekti isikuandmeid oma või mis tahes muudel eesmärkidel kui need, mis on sätestatud käesolevas </w:t>
-      </w:r>
-      <w:proofErr w:type="spellStart"/>
-      <w:r>
-        <w:rPr>
-          <w:rFonts w:ascii="Times New Roman" w:hAnsi="Times New Roman" w:cs="Times New Roman"/>
-          <w:sz w:val="24"/>
-          <w:szCs w:val="24"/>
-        </w:rPr>
-        <w:t>ATL-is</w:t>
-      </w:r>
-      <w:proofErr w:type="spellEnd"/>
-      <w:r>
-        <w:rPr>
-          <w:rFonts w:ascii="Times New Roman" w:hAnsi="Times New Roman" w:cs="Times New Roman"/>
-          <w:sz w:val="24"/>
-          <w:szCs w:val="24"/>
-        </w:rPr>
-        <w:t xml:space="preserve">. </w:t>
-      </w:r>
-    </w:p>
-    <w:p>
-      <w:pPr>
-        <w:pStyle w:val="ListParagraph"/>
-        <w:numPr>
-          <w:ilvl w:val="2"/>
-          <w:numId w:val="15"/>
-        </w:numPr>
-        <w:jc w:val="both"/>
-        <w:rPr>
-          <w:rFonts w:ascii="Times New Roman" w:hAnsi="Times New Roman" w:cs="Times New Roman"/>
-          <w:sz w:val="24"/>
-          <w:szCs w:val="24"/>
-        </w:rPr>
-      </w:pPr>
-      <w:r>
-        <w:rPr>
-          <w:rFonts w:ascii="Times New Roman" w:hAnsi="Times New Roman" w:cs="Times New Roman"/>
-          <w:sz w:val="24"/>
-          <w:szCs w:val="24"/>
-        </w:rPr>
-        <w:t xml:space="preserve">Teenuse osutamisel aset leidnud isikuandmete töötlemise rikkumise korral teavitab volitatud töötleja sellest viivitamatult vastutavat töötlejat </w:t>
-      </w:r>
-      <w:r>
-        <w:rPr>
-          <w:rFonts w:ascii="Times New Roman" w:hAnsi="Times New Roman" w:cs="Times New Roman"/>
-          <w:sz w:val="24"/>
-          <w:szCs w:val="24"/>
-          <w:highlight w:val="yellow"/>
-        </w:rPr>
-        <w:t>e-posti aadressil […].</w:t>
-      </w:r>
-      <w:r>
-        <w:rPr>
-          <w:rFonts w:ascii="Times New Roman" w:hAnsi="Times New Roman" w:cs="Times New Roman"/>
-          <w:sz w:val="24"/>
-          <w:szCs w:val="24"/>
-        </w:rPr>
-        <w:t xml:space="preserve"> Teates annab volitatud töötleja vastutavale töötlejale teavet asjaoludest, mis on põhjustanud isikuandmetega seotud rikkumise, ning ükskõik mis muust isikuandmete vastutava töötleja poolt mõistlikult nõutud seonduvast teabest, mis isikuandmete volitatud töötlejale kättesaadav on.</w:t>
+        </w:rPr>
+      </w:pPr>
+      <w:r>
+        <w:rPr>
+          <w:rFonts w:ascii="Times New Roman" w:hAnsi="Times New Roman" w:cs="Times New Roman"/>
+          <w:sz w:val="24"/>
+          <w:szCs w:val="24"/>
+        </w:rPr>
+        <w:t xml:space="preserve">Pool esitab teisele poolele käesoleva lepingu alusel toimuva isikuandmete töötlemise kohta kõik vajalikud andmed ja dokumendid, kui see on vajalik poolele kohaldatava õiguse kohaselt pandud ülesannete täitmiseks. Pool esitab teisele poolele kogu teabe ja dokumentatsiooni ning osutab vajalikku abi, et poolel oleks võimalik pidada kinni kohaldatava õiguse nõuetest ning tõendada vastavust sellistele nõuetele. </w:t>
       </w:r>
     </w:p>
     <w:p>
@@ -753,30 +868,23 @@
           <w:sz w:val="24"/>
           <w:szCs w:val="24"/>
         </w:rPr>
-        <w:t xml:space="preserve">Pool esitab teisele poolele käesoleva lepingu alusel toimuva isikuandmete töötlemise kohta kõik vajalikud andmed ja dokumendid, kui see on vajalik poolele kohaldatava õiguse kohaselt pandud ülesannete täitmiseks. Pool esitab teisele poolele kogu teabe ja dokumentatsiooni ning osutab vajalikku abi, et poolel oleks võimalik pidada kinni kohaldatava õiguse nõuetest ning tõendada vastavust sellistele nõuetele. </w:t>
-      </w:r>
-    </w:p>
-    <w:p>
-      <w:pPr>
-        <w:pStyle w:val="ListParagraph"/>
-        <w:numPr>
-          <w:ilvl w:val="1"/>
-          <w:numId w:val="15"/>
-        </w:numPr>
-        <w:jc w:val="both"/>
-        <w:rPr>
-          <w:rFonts w:ascii="Times New Roman" w:hAnsi="Times New Roman" w:cs="Times New Roman"/>
-          <w:sz w:val="24"/>
-          <w:szCs w:val="24"/>
-        </w:rPr>
-      </w:pPr>
-      <w:r>
-        <w:rPr>
-          <w:rFonts w:ascii="Times New Roman" w:hAnsi="Times New Roman" w:cs="Times New Roman"/>
-          <w:sz w:val="24"/>
-          <w:szCs w:val="24"/>
-        </w:rPr>
-        <w:t>Kui andmesubjekt taotleb poolelt teavet tema kohta kogutud isikuandmete kohta, teevad pooled andmesubjekti vastava taotluse lahendamisel koostööd ja abistavad teineteist koondamaks teavet asjakohaste tehniliste ja korralduslike meetmete kohta, mida pool isikuandmete töötlemise rakendab. Volitatud töötleja peab tagama, et tema süsteemid ja protsessid oleksid üles ehitatud nii, et punktis 2.1.2 märgitud andmetöötlejal oleks alati võimalik kõigi andmesubjektide taotlustele kiiresti vastata ning asjaomaste vastuste suhtes kohaldatava õigusega sätestatud tähtaegadest kinni pidada.</w:t>
+        <w:t>Kui andmesubjekt taotleb poolelt teavet tema kohta kogutud isikuandmete kohta, teevad pooled andmesubjekti vastava taotluse lahendamisel koostööd ja abistavad teineteist koondamaks teavet asjakohaste tehniliste ja korralduslike meetmete kohta, mida pool isikuandmete töötlemise rakendab. Volitatud töötleja peab tagama, et tema süsteemid ja protsessid oleksid üles ehitatud nii, et punktis 2.1.</w:t>
+      </w:r>
+      <w:r>
+        <w:rPr>
+          <w:rFonts w:ascii="Times New Roman" w:hAnsi="Times New Roman" w:cs="Times New Roman"/>
+          <w:sz w:val="24"/>
+          <w:szCs w:val="24"/>
+        </w:rPr>
+        <w:t>1</w:t>
+      </w:r>
+      <w:r>
+        <w:rPr>
+          <w:rFonts w:ascii="Times New Roman" w:hAnsi="Times New Roman" w:cs="Times New Roman"/>
+          <w:sz w:val="24"/>
+          <w:szCs w:val="24"/>
+        </w:rPr>
+        <w:t xml:space="preserve"> märgitud andmetöötlejal oleks alati võimalik kõigi andmesubjektide taotlustele kiiresti vastata ning asjaomaste vastuste suhtes kohaldatava õigusega sätestatud tähtaegadest kinni pidada.</w:t>
       </w:r>
     </w:p>
     <w:p>
@@ -877,25 +985,7 @@
           <w:sz w:val="24"/>
           <w:szCs w:val="24"/>
         </w:rPr>
-        <w:t xml:space="preserve">Pool vastutab teisele poolele käesoleva </w:t>
-      </w:r>
-      <w:proofErr w:type="spellStart"/>
-      <w:r>
-        <w:rPr>
-          <w:rFonts w:ascii="Times New Roman" w:hAnsi="Times New Roman" w:cs="Times New Roman"/>
-          <w:sz w:val="24"/>
-          <w:szCs w:val="24"/>
-        </w:rPr>
-        <w:t>ATL-i</w:t>
-      </w:r>
-      <w:proofErr w:type="spellEnd"/>
-      <w:r>
-        <w:rPr>
-          <w:rFonts w:ascii="Times New Roman" w:hAnsi="Times New Roman" w:cs="Times New Roman"/>
-          <w:sz w:val="24"/>
-          <w:szCs w:val="24"/>
-        </w:rPr>
-        <w:t xml:space="preserve"> või kohaldatava õiguse või pädeva andmekaitseasutuse otsusega vastuolus oleva tegevusega tekitatud kahju eest.</w:t>
+        <w:t>Pool vastutab teisele poolele käesoleva ATL-i või kohaldatava õiguse või pädeva andmekaitseasutuse otsusega vastuolus oleva tegevusega tekitatud kahju eest.</w:t>
       </w:r>
     </w:p>
     <w:p>
@@ -918,25 +1008,7 @@
           <w:sz w:val="24"/>
           <w:szCs w:val="24"/>
         </w:rPr>
-        <w:t xml:space="preserve">Kui poole vastu suunatud nõue või trahv on põhjustatud käesoleva </w:t>
-      </w:r>
-      <w:proofErr w:type="spellStart"/>
-      <w:r>
-        <w:rPr>
-          <w:rFonts w:ascii="Times New Roman" w:hAnsi="Times New Roman" w:cs="Times New Roman"/>
-          <w:sz w:val="24"/>
-          <w:szCs w:val="24"/>
-        </w:rPr>
-        <w:t>ATL-i</w:t>
-      </w:r>
-      <w:proofErr w:type="spellEnd"/>
-      <w:r>
-        <w:rPr>
-          <w:rFonts w:ascii="Times New Roman" w:hAnsi="Times New Roman" w:cs="Times New Roman"/>
-          <w:sz w:val="24"/>
-          <w:szCs w:val="24"/>
-        </w:rPr>
-        <w:t xml:space="preserve"> või kohaldatava õiguse rikkumisest, teavitab rikkunud poolt teist poolt sellest viivitamatult ning rakendab kõikvõimalikke meetmeid, et leevendada sellisest rikkumisest tulenevat kahju.</w:t>
+        <w:t>Kui poole vastu suunatud nõue või trahv on põhjustatud käesoleva ATL-i või kohaldatava õiguse rikkumisest, teavitab rikkunud poolt teist poolt sellest viivitamatult ning rakendab kõikvõimalikke meetmeid, et leevendada sellisest rikkumisest tulenevat kahju.</w:t>
       </w:r>
     </w:p>
     <w:p>
@@ -1075,7 +1147,7 @@
           </w:tcPr>
           <w:p>
             <w:r>
-              <w:t>Kätlin Tammoja</w:t>
+              <w:t>Joel Järvik</w:t>
             </w:r>
           </w:p>
         </w:tc>
@@ -1106,13 +1178,7 @@
           </w:tcPr>
           <w:p>
             <w:r>
-              <w:t>katlin</w:t>
-            </w:r>
-            <w:r>
-              <w:t>.</w:t>
-            </w:r>
-            <w:r>
-              <w:t>tammoja</w:t>
+              <w:t>joel.jarvik</w:t>
             </w:r>
             <w:r>
               <w:t>@ria.ee</w:t>
@@ -1152,16 +1218,10 @@
               <w:t xml:space="preserve">+372 </w:t>
             </w:r>
             <w:r>
-              <w:t>58</w:t>
+              <w:t>5</w:t>
             </w:r>
             <w:r>
-              <w:t>53</w:t>
-            </w:r>
-            <w:r>
-              <w:t xml:space="preserve"> </w:t>
-            </w:r>
-            <w:r>
-              <w:t>4994</w:t>
+              <w:t>6476192</w:t>
             </w:r>
           </w:p>
         </w:tc>
@@ -1298,6 +1358,8 @@
     <w:p/>
     <w:p/>
     <w:p/>
+    <w:p/>
+    <w:p/>
     <w:p>
       <w:pPr>
         <w:pStyle w:val="ListParagraph"/>
@@ -1309,34 +1371,26 @@
           <w:rFonts w:ascii="Times New Roman" w:hAnsi="Times New Roman" w:cs="Times New Roman"/>
           <w:sz w:val="24"/>
           <w:szCs w:val="24"/>
-          <w:u w:val="single"/>
-        </w:rPr>
-      </w:pPr>
-      <w:r>
-        <w:rPr>
-          <w:rFonts w:ascii="Times New Roman" w:hAnsi="Times New Roman" w:cs="Times New Roman"/>
-          <w:sz w:val="24"/>
-          <w:szCs w:val="24"/>
           <w:highlight w:val="yellow"/>
           <w:u w:val="single"/>
         </w:rPr>
+      </w:pPr>
+      <w:r>
+        <w:rPr>
+          <w:rFonts w:ascii="Times New Roman" w:hAnsi="Times New Roman" w:cs="Times New Roman"/>
+          <w:sz w:val="24"/>
+          <w:szCs w:val="24"/>
+          <w:highlight w:val="yellow"/>
+          <w:u w:val="single"/>
+        </w:rPr>
         <w:lastRenderedPageBreak/>
-        <w:t>Vastutava töötleja kontaktandmed</w:t>
-      </w:r>
-      <w:r>
-        <w:rPr>
-          <w:rFonts w:ascii="Times New Roman" w:hAnsi="Times New Roman" w:cs="Times New Roman"/>
-          <w:sz w:val="24"/>
-          <w:szCs w:val="24"/>
-          <w:u w:val="single"/>
-        </w:rPr>
-        <w:t>:</w:t>
+        <w:t>Vastutava töötleja kontaktandmed:</w:t>
       </w:r>
     </w:p>
     <w:tbl>
       <w:tblPr>
         <w:tblStyle w:val="TableGrid"/>
-        <w:tblW w:w="0" w:type="auto"/>
+        <w:tblW w:w="7655" w:type="dxa"/>
         <w:tblLook w:val="04A0" w:firstRow="1" w:lastRow="0" w:firstColumn="1" w:lastColumn="0" w:noHBand="0" w:noVBand="1"/>
       </w:tblPr>
       <w:tblGrid>
@@ -1365,6 +1419,7 @@
             <w:tcW w:w="6598" w:type="dxa"/>
             <w:tcBorders>
               <w:left w:val="single" w:sz="4" w:space="0" w:color="auto"/>
+              <w:right w:val="single" w:sz="4" w:space="0" w:color="auto"/>
             </w:tcBorders>
           </w:tcPr>
           <w:p/>
@@ -1392,6 +1447,7 @@
             <w:tcW w:w="6598" w:type="dxa"/>
             <w:tcBorders>
               <w:left w:val="single" w:sz="4" w:space="0" w:color="auto"/>
+              <w:right w:val="single" w:sz="4" w:space="0" w:color="auto"/>
             </w:tcBorders>
           </w:tcPr>
           <w:p/>
@@ -1419,16 +1475,20 @@
             <w:tcW w:w="6598" w:type="dxa"/>
             <w:tcBorders>
               <w:left w:val="single" w:sz="4" w:space="0" w:color="auto"/>
+              <w:right w:val="single" w:sz="4" w:space="0" w:color="auto"/>
             </w:tcBorders>
           </w:tcPr>
-          <w:p>
-            <w:r>
-              <w:t xml:space="preserve">+372 </w:t>
-            </w:r>
-          </w:p>
+          <w:p/>
         </w:tc>
       </w:tr>
     </w:tbl>
+    <w:p>
+      <w:pPr>
+        <w:rPr>
+          <w:color w:val="000000" w:themeColor="text1"/>
+        </w:rPr>
+      </w:pPr>
+    </w:p>
     <w:p>
       <w:pPr>
         <w:rPr>
@@ -1446,13 +1506,17 @@
         <w:ind w:left="284" w:hanging="426"/>
         <w:rPr>
           <w:rFonts w:ascii="Times New Roman" w:hAnsi="Times New Roman" w:cs="Times New Roman"/>
-          <w:sz w:val="24"/>
-          <w:szCs w:val="24"/>
-        </w:rPr>
-      </w:pPr>
-      <w:r>
-        <w:rPr>
-          <w:rFonts w:ascii="Times New Roman" w:hAnsi="Times New Roman" w:cs="Times New Roman"/>
+          <w:b/>
+          <w:bCs/>
+          <w:sz w:val="24"/>
+          <w:szCs w:val="24"/>
+        </w:rPr>
+      </w:pPr>
+      <w:r>
+        <w:rPr>
+          <w:rFonts w:ascii="Times New Roman" w:hAnsi="Times New Roman" w:cs="Times New Roman"/>
+          <w:b/>
+          <w:bCs/>
           <w:sz w:val="24"/>
           <w:szCs w:val="24"/>
         </w:rPr>
@@ -1489,7 +1553,71 @@
           <w:sz w:val="24"/>
           <w:szCs w:val="24"/>
         </w:rPr>
-        <w:t>Käesolev ATL kehtib teenuse osutamisel tähtajatult.</w:t>
+        <w:t>Käesolev ATL kehtib teenuse osutamisel tähtajatult</w:t>
+      </w:r>
+      <w:r>
+        <w:rPr>
+          <w:rFonts w:ascii="Times New Roman" w:hAnsi="Times New Roman" w:cs="Times New Roman"/>
+          <w:sz w:val="24"/>
+          <w:szCs w:val="24"/>
+        </w:rPr>
+        <w:t xml:space="preserve"> või kuni vastutavale töötlejale </w:t>
+      </w:r>
+      <w:r>
+        <w:rPr>
+          <w:rFonts w:ascii="Times New Roman" w:hAnsi="Times New Roman" w:cs="Times New Roman"/>
+          <w:sz w:val="24"/>
+          <w:szCs w:val="24"/>
+        </w:rPr>
+        <w:t>isikuandmete töötlemiseks kohald</w:t>
+      </w:r>
+      <w:r>
+        <w:rPr>
+          <w:rFonts w:ascii="Times New Roman" w:hAnsi="Times New Roman" w:cs="Times New Roman"/>
+          <w:sz w:val="24"/>
+          <w:szCs w:val="24"/>
+        </w:rPr>
+        <w:t>uva</w:t>
+      </w:r>
+      <w:r>
+        <w:rPr>
+          <w:rFonts w:ascii="Times New Roman" w:hAnsi="Times New Roman" w:cs="Times New Roman"/>
+          <w:sz w:val="24"/>
+          <w:szCs w:val="24"/>
+        </w:rPr>
+        <w:t xml:space="preserve"> õiguslik</w:t>
+      </w:r>
+      <w:r>
+        <w:rPr>
+          <w:rFonts w:ascii="Times New Roman" w:hAnsi="Times New Roman" w:cs="Times New Roman"/>
+          <w:sz w:val="24"/>
+          <w:szCs w:val="24"/>
+        </w:rPr>
+        <w:t>u</w:t>
+      </w:r>
+      <w:r>
+        <w:rPr>
+          <w:rFonts w:ascii="Times New Roman" w:hAnsi="Times New Roman" w:cs="Times New Roman"/>
+          <w:sz w:val="24"/>
+          <w:szCs w:val="24"/>
+        </w:rPr>
+        <w:t xml:space="preserve"> alus</w:t>
+      </w:r>
+      <w:r>
+        <w:rPr>
+          <w:rFonts w:ascii="Times New Roman" w:hAnsi="Times New Roman" w:cs="Times New Roman"/>
+          <w:sz w:val="24"/>
+          <w:szCs w:val="24"/>
+        </w:rPr>
+        <w:t>e kehtivuse lõppemiseni</w:t>
+      </w:r>
+      <w:r>
+        <w:rPr>
+          <w:rFonts w:ascii="Times New Roman" w:hAnsi="Times New Roman" w:cs="Times New Roman"/>
+          <w:sz w:val="24"/>
+          <w:szCs w:val="24"/>
+        </w:rPr>
+        <w:t>.</w:t>
       </w:r>
     </w:p>
     <w:p/>
@@ -1550,25 +1678,7 @@
           <w:sz w:val="24"/>
           <w:szCs w:val="24"/>
         </w:rPr>
-        <w:t xml:space="preserve">Teenuse osutamise lõpetamisel lõpeb volitatud töötleja õigus töödelda käesoleva </w:t>
-      </w:r>
-      <w:proofErr w:type="spellStart"/>
-      <w:r>
-        <w:rPr>
-          <w:rFonts w:ascii="Times New Roman" w:hAnsi="Times New Roman" w:cs="Times New Roman"/>
-          <w:sz w:val="24"/>
-          <w:szCs w:val="24"/>
-        </w:rPr>
-        <w:t>ATL-i</w:t>
-      </w:r>
-      <w:proofErr w:type="spellEnd"/>
-      <w:r>
-        <w:rPr>
-          <w:rFonts w:ascii="Times New Roman" w:hAnsi="Times New Roman" w:cs="Times New Roman"/>
-          <w:sz w:val="24"/>
-          <w:szCs w:val="24"/>
-        </w:rPr>
-        <w:t xml:space="preserve"> alusel vastutava töötleja nimel andmesubjekti isikuandmeid automaatselt. </w:t>
+        <w:t xml:space="preserve">Teenuse osutamise lõpetamisel lõpeb volitatud töötleja õigus töödelda käesoleva ATL-i alusel vastutava töötleja nimel andmesubjekti isikuandmeid automaatselt. </w:t>
       </w:r>
     </w:p>
     <w:p>
@@ -1584,23 +1694,13 @@
           <w:szCs w:val="24"/>
         </w:rPr>
       </w:pPr>
-      <w:proofErr w:type="spellStart"/>
-      <w:r>
-        <w:rPr>
-          <w:rFonts w:ascii="Times New Roman" w:hAnsi="Times New Roman" w:cs="Times New Roman"/>
-          <w:sz w:val="24"/>
-          <w:szCs w:val="24"/>
-        </w:rPr>
-        <w:t>ATL-i</w:t>
-      </w:r>
-      <w:proofErr w:type="spellEnd"/>
-      <w:r>
-        <w:rPr>
-          <w:rFonts w:ascii="Times New Roman" w:hAnsi="Times New Roman" w:cs="Times New Roman"/>
-          <w:sz w:val="24"/>
-          <w:szCs w:val="24"/>
-        </w:rPr>
-        <w:t xml:space="preserve"> lõppemisel kustutab volitatud töötleja kõik teenuse osutamisel kogutud isikuandmed ning esitab vastutavale töötlejale tema poolt nõutud andmed ja teabe. Pooltel on õigus sõlmida täiendavaid kokkuleppeid isikuandmete töötlemise lõpetamise tingimustes. </w:t>
+      <w:r>
+        <w:rPr>
+          <w:rFonts w:ascii="Times New Roman" w:hAnsi="Times New Roman" w:cs="Times New Roman"/>
+          <w:sz w:val="24"/>
+          <w:szCs w:val="24"/>
+        </w:rPr>
+        <w:t xml:space="preserve">ATL-i lõppemisel kustutab volitatud töötleja kõik teenuse osutamisel kogutud isikuandmed ning esitab vastutavale töötlejale tema poolt nõutud andmed ja teabe. Pooltel on õigus sõlmida täiendavaid kokkuleppeid isikuandmete töötlemise lõpetamise tingimustes. </w:t>
       </w:r>
     </w:p>
     <w:p>
@@ -1671,25 +1771,7 @@
           <w:sz w:val="24"/>
           <w:szCs w:val="24"/>
         </w:rPr>
-        <w:t xml:space="preserve">Käesolevale </w:t>
-      </w:r>
-      <w:proofErr w:type="spellStart"/>
-      <w:r>
-        <w:rPr>
-          <w:rFonts w:ascii="Times New Roman" w:hAnsi="Times New Roman" w:cs="Times New Roman"/>
-          <w:sz w:val="24"/>
-          <w:szCs w:val="24"/>
-        </w:rPr>
-        <w:t>ATL-ile</w:t>
-      </w:r>
-      <w:proofErr w:type="spellEnd"/>
-      <w:r>
-        <w:rPr>
-          <w:rFonts w:ascii="Times New Roman" w:hAnsi="Times New Roman" w:cs="Times New Roman"/>
-          <w:sz w:val="24"/>
-          <w:szCs w:val="24"/>
-        </w:rPr>
-        <w:t xml:space="preserve"> kohaldatakse Eesti Vabariigis kehtivat õigust.</w:t>
+        <w:t>Käesolevale ATL-ile kohaldatakse Eesti Vabariigis kehtivat õigust.</w:t>
       </w:r>
     </w:p>
     <w:p>
@@ -1711,25 +1793,7 @@
           <w:sz w:val="24"/>
           <w:szCs w:val="24"/>
         </w:rPr>
-        <w:t xml:space="preserve">Käesolevast </w:t>
-      </w:r>
-      <w:proofErr w:type="spellStart"/>
-      <w:r>
-        <w:rPr>
-          <w:rFonts w:ascii="Times New Roman" w:hAnsi="Times New Roman" w:cs="Times New Roman"/>
-          <w:sz w:val="24"/>
-          <w:szCs w:val="24"/>
-        </w:rPr>
-        <w:t>ATL-st</w:t>
-      </w:r>
-      <w:proofErr w:type="spellEnd"/>
-      <w:r>
-        <w:rPr>
-          <w:rFonts w:ascii="Times New Roman" w:hAnsi="Times New Roman" w:cs="Times New Roman"/>
-          <w:sz w:val="24"/>
-          <w:szCs w:val="24"/>
-        </w:rPr>
-        <w:t xml:space="preserve"> tulenevad vaidlused lahendatakse poolte vahel läbirääkimiste teel. Kui pooled kokkulepet ei saavuta, lahendatakse vaidlus vastavalt Eesti Vabariigis kehtivatele seadustele.</w:t>
+        <w:t>Käesolevast ATL-st tulenevad vaidlused lahendatakse poolte vahel läbirääkimiste teel. Kui pooled kokkulepet ei saavuta, lahendatakse vaidlus vastavalt Eesti Vabariigis kehtivatele seadustele.</w:t>
       </w:r>
     </w:p>
     <w:p>
@@ -1782,7 +1846,7 @@
       <w:tblPr>
         <w:tblStyle w:val="TableGrid"/>
         <w:tblW w:w="0" w:type="auto"/>
-        <w:tblInd w:w="567" w:type="dxa"/>
+        <w:tblInd w:w="421" w:type="dxa"/>
         <w:tblBorders>
           <w:top w:val="none" w:sz="0" w:space="0" w:color="auto"/>
           <w:left w:val="none" w:sz="0" w:space="0" w:color="auto"/>
@@ -1794,21 +1858,20 @@
         <w:tblLook w:val="04A0" w:firstRow="1" w:lastRow="0" w:firstColumn="1" w:lastColumn="0" w:noHBand="0" w:noVBand="1"/>
       </w:tblPr>
       <w:tblGrid>
-        <w:gridCol w:w="3256"/>
-        <w:gridCol w:w="1559"/>
+        <w:gridCol w:w="3548"/>
+        <w:gridCol w:w="1413"/>
         <w:gridCol w:w="3962"/>
       </w:tblGrid>
       <w:tr>
         <w:tc>
           <w:tcPr>
-            <w:tcW w:w="3256" w:type="dxa"/>
+            <w:tcW w:w="3548" w:type="dxa"/>
           </w:tcPr>
           <w:p>
             <w:pPr>
               <w:rPr>
                 <w:b/>
                 <w:bCs/>
-                <w:highlight w:val="yellow"/>
               </w:rPr>
             </w:pPr>
             <w:r>
@@ -1817,7 +1880,15 @@
                 <w:bCs/>
                 <w:highlight w:val="yellow"/>
               </w:rPr>
-              <w:t>Asutuse nimi</w:t>
+              <w:t>Asutus</w:t>
+            </w:r>
+            <w:r>
+              <w:rPr>
+                <w:b/>
+                <w:bCs/>
+                <w:highlight w:val="yellow"/>
+              </w:rPr>
+              <w:t>e nimi</w:t>
             </w:r>
           </w:p>
           <w:p>
@@ -1825,14 +1896,13 @@
               <w:rPr>
                 <w:b/>
                 <w:bCs/>
-                <w:highlight w:val="yellow"/>
               </w:rPr>
             </w:pPr>
           </w:p>
         </w:tc>
         <w:tc>
           <w:tcPr>
-            <w:tcW w:w="1559" w:type="dxa"/>
+            <w:tcW w:w="1413" w:type="dxa"/>
           </w:tcPr>
           <w:p/>
         </w:tc>
@@ -1855,54 +1925,45 @@
               <w:t>Riigi Infosüsteemi Amet</w:t>
             </w:r>
           </w:p>
+          <w:p>
+            <w:pPr>
+              <w:rPr>
+                <w:b/>
+                <w:bCs/>
+              </w:rPr>
+            </w:pPr>
+          </w:p>
+          <w:p>
+            <w:pPr>
+              <w:rPr>
+                <w:b/>
+                <w:bCs/>
+              </w:rPr>
+            </w:pPr>
+          </w:p>
         </w:tc>
       </w:tr>
       <w:tr>
         <w:tc>
           <w:tcPr>
-            <w:tcW w:w="3256" w:type="dxa"/>
+            <w:tcW w:w="3548" w:type="dxa"/>
           </w:tcPr>
           <w:p>
-            <w:pPr>
-              <w:rPr>
-                <w:i/>
-                <w:iCs/>
-              </w:rPr>
-            </w:pPr>
             <w:r>
-              <w:rPr>
-                <w:i/>
-                <w:iCs/>
-              </w:rPr>
               <w:t>(</w:t>
             </w:r>
             <w:r>
-              <w:rPr>
-                <w:i/>
-                <w:iCs/>
-              </w:rPr>
               <w:t>allkirjastatud digitaalselt</w:t>
             </w:r>
             <w:r>
-              <w:rPr>
-                <w:i/>
-                <w:iCs/>
-              </w:rPr>
               <w:t>)</w:t>
             </w:r>
           </w:p>
-          <w:p>
-            <w:pPr>
-              <w:rPr>
-                <w:i/>
-                <w:iCs/>
-              </w:rPr>
-            </w:pPr>
-          </w:p>
+          <w:p/>
         </w:tc>
         <w:tc>
           <w:tcPr>
-            <w:tcW w:w="1559" w:type="dxa"/>
+            <w:tcW w:w="1413" w:type="dxa"/>
           </w:tcPr>
           <w:p/>
         </w:tc>
@@ -1911,31 +1972,13 @@
             <w:tcW w:w="3962" w:type="dxa"/>
           </w:tcPr>
           <w:p>
-            <w:pPr>
-              <w:rPr>
-                <w:i/>
-                <w:iCs/>
-              </w:rPr>
-            </w:pPr>
             <w:r>
-              <w:rPr>
-                <w:i/>
-                <w:iCs/>
-              </w:rPr>
               <w:t>(</w:t>
             </w:r>
             <w:r>
-              <w:rPr>
-                <w:i/>
-                <w:iCs/>
-              </w:rPr>
               <w:t>allkirjastatud digitaalselt</w:t>
             </w:r>
             <w:r>
-              <w:rPr>
-                <w:i/>
-                <w:iCs/>
-              </w:rPr>
               <w:t>)</w:t>
             </w:r>
           </w:p>
@@ -1944,9 +1987,14 @@
       <w:tr>
         <w:tc>
           <w:tcPr>
-            <w:tcW w:w="3256" w:type="dxa"/>
+            <w:tcW w:w="3548" w:type="dxa"/>
           </w:tcPr>
           <w:p>
+            <w:pPr>
+              <w:rPr>
+                <w:highlight w:val="yellow"/>
+              </w:rPr>
+            </w:pPr>
             <w:r>
               <w:rPr>
                 <w:highlight w:val="yellow"/>
@@ -1957,7 +2005,7 @@
         </w:tc>
         <w:tc>
           <w:tcPr>
-            <w:tcW w:w="1559" w:type="dxa"/>
+            <w:tcW w:w="1413" w:type="dxa"/>
           </w:tcPr>
           <w:p/>
         </w:tc>
@@ -1967,39 +2015,33 @@
           </w:tcPr>
           <w:p>
             <w:r>
-              <w:t xml:space="preserve">Joonas </w:t>
+              <w:t>Joonas Heiter</w:t>
             </w:r>
-            <w:proofErr w:type="spellStart"/>
-            <w:r>
-              <w:t>Heiter</w:t>
-            </w:r>
-            <w:proofErr w:type="spellEnd"/>
           </w:p>
         </w:tc>
       </w:tr>
       <w:tr>
         <w:tc>
           <w:tcPr>
-            <w:tcW w:w="3256" w:type="dxa"/>
+            <w:tcW w:w="3548" w:type="dxa"/>
           </w:tcPr>
           <w:p>
+            <w:pPr>
+              <w:rPr>
+                <w:highlight w:val="yellow"/>
+              </w:rPr>
+            </w:pPr>
             <w:r>
               <w:rPr>
                 <w:highlight w:val="yellow"/>
               </w:rPr>
-              <w:t>a</w:t>
-            </w:r>
-            <w:r>
-              <w:rPr>
-                <w:highlight w:val="yellow"/>
-              </w:rPr>
-              <w:t>metikoht</w:t>
+              <w:t>ametikoht</w:t>
             </w:r>
           </w:p>
         </w:tc>
         <w:tc>
           <w:tcPr>
-            <w:tcW w:w="1559" w:type="dxa"/>
+            <w:tcW w:w="1413" w:type="dxa"/>
           </w:tcPr>
           <w:p/>
         </w:tc>
@@ -2009,10 +2051,7 @@
           </w:tcPr>
           <w:p>
             <w:r>
-              <w:t>p</w:t>
-            </w:r>
-            <w:r>
-              <w:t>eadirektor</w:t>
+              <w:t>peadirektor</w:t>
             </w:r>
           </w:p>
         </w:tc>
@@ -2088,29 +2127,11 @@
       </w:r>
       <w:r>
         <w:rPr>
-          <w:color w:val="000000" w:themeColor="text1"/>
           <w:highlight w:val="yellow"/>
         </w:rPr>
-        <w:t>[…</w:t>
-      </w:r>
-      <w:r>
-        <w:rPr>
-          <w:color w:val="000000" w:themeColor="text1"/>
-          <w:highlight w:val="yellow"/>
-        </w:rPr>
-        <w:t>kellele?...</w:t>
-      </w:r>
-      <w:r>
-        <w:rPr>
-          <w:color w:val="000000" w:themeColor="text1"/>
-          <w:highlight w:val="yellow"/>
-        </w:rPr>
-        <w:t>]</w:t>
-      </w:r>
-      <w:r>
-        <w:rPr>
-          <w:color w:val="000000" w:themeColor="text1"/>
-        </w:rPr>
+        <w:t>[…kellele?...]</w:t>
+      </w:r>
+      <w:r>
         <w:t xml:space="preserve"> </w:t>
       </w:r>
       <w:r>
@@ -2215,18 +2236,13 @@
         <w:t>Töödeldavate isikuandmete liik ja kategooriad</w:t>
       </w:r>
     </w:p>
-    <w:p>
-      <w:pPr>
-        <w:rPr>
-          <w:color w:val="000000" w:themeColor="text1"/>
-        </w:rPr>
-      </w:pPr>
-      <w:r>
-        <w:rPr>
-          <w:color w:val="000000" w:themeColor="text1"/>
+    <w:p/>
+    <w:p>
+      <w:r>
+        <w:rPr>
           <w:highlight w:val="yellow"/>
         </w:rPr>
-        <w:t>[…]</w:t>
+        <w:t>[…..]</w:t>
       </w:r>
     </w:p>
     <w:p>
@@ -2297,14 +2313,12 @@
         <w:suppressAutoHyphens w:val="0"/>
         <w:spacing w:line="276" w:lineRule="auto"/>
       </w:pPr>
-      <w:proofErr w:type="spellStart"/>
       <w:r>
         <w:rPr>
           <w:b/>
         </w:rPr>
         <w:t>GovSSO</w:t>
       </w:r>
-      <w:proofErr w:type="spellEnd"/>
       <w:r>
         <w:rPr>
           <w:b/>
@@ -2335,35 +2349,7 @@
         <w:rPr>
           <w:b/>
         </w:rPr>
-        <w:t xml:space="preserve">JSON </w:t>
-      </w:r>
-      <w:proofErr w:type="spellStart"/>
-      <w:r>
-        <w:rPr>
-          <w:b/>
-        </w:rPr>
-        <w:t>Web</w:t>
-      </w:r>
-      <w:proofErr w:type="spellEnd"/>
-      <w:r>
-        <w:rPr>
-          <w:b/>
-        </w:rPr>
-        <w:t xml:space="preserve"> </w:t>
-      </w:r>
-      <w:proofErr w:type="spellStart"/>
-      <w:r>
-        <w:rPr>
-          <w:b/>
-        </w:rPr>
-        <w:t>Tokenite</w:t>
-      </w:r>
-      <w:proofErr w:type="spellEnd"/>
-      <w:r>
-        <w:rPr>
-          <w:b/>
-        </w:rPr>
-        <w:t xml:space="preserve"> (JWT)</w:t>
+        <w:t>JSON Web Tokenite (JWT)</w:t>
       </w:r>
       <w:r>
         <w:t xml:space="preserve"> kujul, mis on laialtlevinud ja tehnoloogiliselt turvaline lahendus</w:t>
@@ -2386,15 +2372,7 @@
         <w:t>X-tee päringuid teostab</w:t>
       </w:r>
       <w:r>
-        <w:t xml:space="preserve"> Andmejälgija </w:t>
-      </w:r>
-      <w:proofErr w:type="spellStart"/>
-      <w:r>
-        <w:t>backend</w:t>
-      </w:r>
-      <w:proofErr w:type="spellEnd"/>
-      <w:r>
-        <w:t xml:space="preserve"> komponen</w:t>
+        <w:t xml:space="preserve"> Andmejälgija backend komponen</w:t>
       </w:r>
       <w:r>
         <w:rPr>
@@ -2412,15 +2390,7 @@
         <w:t xml:space="preserve">võtab vastu </w:t>
       </w:r>
       <w:r>
-        <w:t xml:space="preserve">kasutaja </w:t>
-      </w:r>
-      <w:proofErr w:type="spellStart"/>
-      <w:r>
-        <w:t>sirvikust</w:t>
-      </w:r>
-      <w:proofErr w:type="spellEnd"/>
-      <w:r>
-        <w:t xml:space="preserve"> tulnud päringu, </w:t>
+        <w:t xml:space="preserve">kasutaja sirvikust tulnud päringu, </w:t>
       </w:r>
       <w:r>
         <w:t>kontrollib</w:t>
@@ -2429,15 +2399,7 @@
         <w:t xml:space="preserve"> kasutaja sessiooni, </w:t>
       </w:r>
       <w:r>
-        <w:t xml:space="preserve">teostab X-tee päringud registritesse, ning seejärel tagastab </w:t>
-      </w:r>
-      <w:proofErr w:type="spellStart"/>
-      <w:r>
-        <w:t>sirvikule</w:t>
-      </w:r>
-      <w:proofErr w:type="spellEnd"/>
-      <w:r>
-        <w:t xml:space="preserve"> tulemused.</w:t>
+        <w:t>teostab X-tee päringud registritesse, ning seejärel tagastab sirvikule tulemused.</w:t>
       </w:r>
     </w:p>
     <w:p>
@@ -2501,15 +2463,7 @@
         <w:t>Vault muutujatena.</w:t>
       </w:r>
       <w:r>
-        <w:t xml:space="preserve"> See tähendab, et tundlikud andmed, mis võimaldaksid süsteemi kompromiteerida, ei leki arendaja hooletusest näiteks </w:t>
-      </w:r>
-      <w:proofErr w:type="spellStart"/>
-      <w:r>
-        <w:t>koodirepositooriumite</w:t>
-      </w:r>
-      <w:proofErr w:type="spellEnd"/>
-      <w:r>
-        <w:t xml:space="preserve"> kaudu.</w:t>
+        <w:t xml:space="preserve"> See tähendab, et tundlikud andmed, mis võimaldaksid süsteemi kompromiteerida, ei leki arendaja hooletusest näiteks koodirepositooriumite kaudu.</w:t>
       </w:r>
     </w:p>
     <w:p>
@@ -2537,15 +2491,7 @@
         <w:spacing w:line="276" w:lineRule="auto"/>
       </w:pPr>
       <w:r>
-        <w:t xml:space="preserve">Kõik muudatused, sealhulgas teenuste konfiguratsioonide omad, tehakse läbi </w:t>
-      </w:r>
-      <w:proofErr w:type="spellStart"/>
-      <w:r>
-        <w:t>Giti</w:t>
-      </w:r>
-      <w:proofErr w:type="spellEnd"/>
-      <w:r>
-        <w:t xml:space="preserve">, millega tagatakse nõuetekohane versioonihaldus. </w:t>
+        <w:t xml:space="preserve">Kõik muudatused, sealhulgas teenuste konfiguratsioonide omad, tehakse läbi Giti, millega tagatakse nõuetekohane versioonihaldus. </w:t>
       </w:r>
     </w:p>
     <w:p>
@@ -2610,8 +2556,7 @@
       </w:pPr>
     </w:p>
     <w:sectPr>
-      <w:footerReference w:type="default" r:id="rId9"/>
-      <w:footerReference w:type="first" r:id="rId10"/>
+      <w:footerReference w:type="default" r:id="rId8"/>
       <w:pgSz w:w="11906" w:h="16838"/>
       <w:pgMar w:top="907" w:right="851" w:bottom="1418" w:left="1701" w:header="709" w:footer="709" w:gutter="0"/>
       <w:cols w:space="708"/>
@@ -2623,7 +2568,7 @@
 </file>
 
 <file path=word/endnotes.xml><?xml version="1.0" encoding="utf-8"?>
-<w:endnotes xmlns:wpc="http://schemas.microsoft.com/office/word/2010/wordprocessingCanvas" xmlns:cx="http://schemas.microsoft.com/office/drawing/2014/chartex" xmlns:cx1="http://schemas.microsoft.com/office/drawing/2015/9/8/chartex" xmlns:cx2="http://schemas.microsoft.com/office/drawing/2015/10/21/chartex" xmlns:cx3="http://schemas.microsoft.com/office/drawing/2016/5/9/chartex" xmlns:cx4="http://schemas.microsoft.com/office/drawing/2016/5/10/chartex" xmlns:cx5="http://schemas.microsoft.com/office/drawing/2016/5/11/chartex" xmlns:cx6="http://schemas.microsoft.com/office/drawing/2016/5/12/chartex" xmlns:cx7="http://schemas.microsoft.com/office/drawing/2016/5/13/chartex" xmlns:cx8="http://schemas.microsoft.com/office/drawing/2016/5/14/chartex" xmlns:mc="http://schemas.openxmlformats.org/markup-compatibility/2006" xmlns:aink="http://schemas.microsoft.com/office/drawing/2016/ink" xmlns:am3d="http://schemas.microsoft.com/office/drawing/2017/model3d" xmlns:o="urn:schemas-microsoft-com:office:office" xmlns:oel="http://schemas.microsoft.com/office/2019/extlst" xmlns:r="http://schemas.openxmlformats.org/officeDocument/2006/relationships" xmlns:m="http://schemas.openxmlformats.org/officeDocument/2006/math" xmlns:v="urn:schemas-microsoft-com:vml" xmlns:wp14="http://schemas.microsoft.com/office/word/2010/wordprocessingDrawing" xmlns:wp="http://schemas.openxmlformats.org/drawingml/2006/wordprocessingDrawing" xmlns:w10="urn:schemas-microsoft-com:office:word" xmlns:w="http://schemas.openxmlformats.org/wordprocessingml/2006/main" xmlns:w14="http://schemas.microsoft.com/office/word/2010/wordml" xmlns:w15="http://schemas.microsoft.com/office/word/2012/wordml" xmlns:w16cex="http://schemas.microsoft.com/office/word/2018/wordml/cex" xmlns:w16cid="http://schemas.microsoft.com/office/word/2016/wordml/cid" xmlns:w16="http://schemas.microsoft.com/office/word/2018/wordml" xmlns:w16sdtdh="http://schemas.microsoft.com/office/word/2020/wordml/sdtdatahash" xmlns:w16se="http://schemas.microsoft.com/office/word/2015/wordml/symex" xmlns:wpg="http://schemas.microsoft.com/office/word/2010/wordprocessingGroup" xmlns:wpi="http://schemas.microsoft.com/office/word/2010/wordprocessingInk" xmlns:wne="http://schemas.microsoft.com/office/word/2006/wordml" xmlns:wps="http://schemas.microsoft.com/office/word/2010/wordprocessingShape" mc:Ignorable="w14 w15 w16se w16cid w16 w16cex w16sdtdh wp14">
+<w:endnotes xmlns:wpc="http://schemas.microsoft.com/office/word/2010/wordprocessingCanvas" xmlns:cx="http://schemas.microsoft.com/office/drawing/2014/chartex" xmlns:cx1="http://schemas.microsoft.com/office/drawing/2015/9/8/chartex" xmlns:cx2="http://schemas.microsoft.com/office/drawing/2015/10/21/chartex" xmlns:cx3="http://schemas.microsoft.com/office/drawing/2016/5/9/chartex" xmlns:cx4="http://schemas.microsoft.com/office/drawing/2016/5/10/chartex" xmlns:cx5="http://schemas.microsoft.com/office/drawing/2016/5/11/chartex" xmlns:cx6="http://schemas.microsoft.com/office/drawing/2016/5/12/chartex" xmlns:cx7="http://schemas.microsoft.com/office/drawing/2016/5/13/chartex" xmlns:cx8="http://schemas.microsoft.com/office/drawing/2016/5/14/chartex" xmlns:mc="http://schemas.openxmlformats.org/markup-compatibility/2006" xmlns:aink="http://schemas.microsoft.com/office/drawing/2016/ink" xmlns:am3d="http://schemas.microsoft.com/office/drawing/2017/model3d" xmlns:o="urn:schemas-microsoft-com:office:office" xmlns:oel="http://schemas.microsoft.com/office/2019/extlst" xmlns:r="http://schemas.openxmlformats.org/officeDocument/2006/relationships" xmlns:m="http://schemas.openxmlformats.org/officeDocument/2006/math" xmlns:v="urn:schemas-microsoft-com:vml" xmlns:wp14="http://schemas.microsoft.com/office/word/2010/wordprocessingDrawing" xmlns:wp="http://schemas.openxmlformats.org/drawingml/2006/wordprocessingDrawing" xmlns:w10="urn:schemas-microsoft-com:office:word" xmlns:w="http://schemas.openxmlformats.org/wordprocessingml/2006/main" xmlns:w14="http://schemas.microsoft.com/office/word/2010/wordml" xmlns:w15="http://schemas.microsoft.com/office/word/2012/wordml" xmlns:w16cex="http://schemas.microsoft.com/office/word/2018/wordml/cex" xmlns:w16cid="http://schemas.microsoft.com/office/word/2016/wordml/cid" xmlns:w16="http://schemas.microsoft.com/office/word/2018/wordml" xmlns:w16du="http://schemas.microsoft.com/office/word/2023/wordml/word16du" xmlns:w16sdtdh="http://schemas.microsoft.com/office/word/2020/wordml/sdtdatahash" xmlns:w16sdtfl="http://schemas.microsoft.com/office/word/2024/wordml/sdtformatlock" xmlns:w16se="http://schemas.microsoft.com/office/word/2015/wordml/symex" xmlns:wpg="http://schemas.microsoft.com/office/word/2010/wordprocessingGroup" xmlns:wpi="http://schemas.microsoft.com/office/word/2010/wordprocessingInk" xmlns:wne="http://schemas.microsoft.com/office/word/2006/wordml" xmlns:wps="http://schemas.microsoft.com/office/word/2010/wordprocessingShape" mc:Ignorable="w14 w15 w16se w16cid w16 w16cex w16sdtdh w16sdtfl w16du wp14">
   <w:endnote w:type="separator" w:id="-1">
     <w:p>
       <w:pPr>
@@ -2648,7 +2593,7 @@
 </file>
 
 <file path=word/footer1.xml><?xml version="1.0" encoding="utf-8"?>
-<w:ftr xmlns:wpc="http://schemas.microsoft.com/office/word/2010/wordprocessingCanvas" xmlns:cx="http://schemas.microsoft.com/office/drawing/2014/chartex" xmlns:cx1="http://schemas.microsoft.com/office/drawing/2015/9/8/chartex" xmlns:cx2="http://schemas.microsoft.com/office/drawing/2015/10/21/chartex" xmlns:cx3="http://schemas.microsoft.com/office/drawing/2016/5/9/chartex" xmlns:cx4="http://schemas.microsoft.com/office/drawing/2016/5/10/chartex" xmlns:cx5="http://schemas.microsoft.com/office/drawing/2016/5/11/chartex" xmlns:cx6="http://schemas.microsoft.com/office/drawing/2016/5/12/chartex" xmlns:cx7="http://schemas.microsoft.com/office/drawing/2016/5/13/chartex" xmlns:cx8="http://schemas.microsoft.com/office/drawing/2016/5/14/chartex" xmlns:mc="http://schemas.openxmlformats.org/markup-compatibility/2006" xmlns:aink="http://schemas.microsoft.com/office/drawing/2016/ink" xmlns:am3d="http://schemas.microsoft.com/office/drawing/2017/model3d" xmlns:o="urn:schemas-microsoft-com:office:office" xmlns:oel="http://schemas.microsoft.com/office/2019/extlst" xmlns:r="http://schemas.openxmlformats.org/officeDocument/2006/relationships" xmlns:m="http://schemas.openxmlformats.org/officeDocument/2006/math" xmlns:v="urn:schemas-microsoft-com:vml" xmlns:wp14="http://schemas.microsoft.com/office/word/2010/wordprocessingDrawing" xmlns:wp="http://schemas.openxmlformats.org/drawingml/2006/wordprocessingDrawing" xmlns:w10="urn:schemas-microsoft-com:office:word" xmlns:w="http://schemas.openxmlformats.org/wordprocessingml/2006/main" xmlns:w14="http://schemas.microsoft.com/office/word/2010/wordml" xmlns:w15="http://schemas.microsoft.com/office/word/2012/wordml" xmlns:w16cex="http://schemas.microsoft.com/office/word/2018/wordml/cex" xmlns:w16cid="http://schemas.microsoft.com/office/word/2016/wordml/cid" xmlns:w16="http://schemas.microsoft.com/office/word/2018/wordml" xmlns:w16sdtdh="http://schemas.microsoft.com/office/word/2020/wordml/sdtdatahash" xmlns:w16se="http://schemas.microsoft.com/office/word/2015/wordml/symex" xmlns:wpg="http://schemas.microsoft.com/office/word/2010/wordprocessingGroup" xmlns:wpi="http://schemas.microsoft.com/office/word/2010/wordprocessingInk" xmlns:wne="http://schemas.microsoft.com/office/word/2006/wordml" xmlns:wps="http://schemas.microsoft.com/office/word/2010/wordprocessingShape" mc:Ignorable="w14 w15 w16se w16cid w16 w16cex w16sdtdh wp14">
+<w:ftr xmlns:wpc="http://schemas.microsoft.com/office/word/2010/wordprocessingCanvas" xmlns:cx="http://schemas.microsoft.com/office/drawing/2014/chartex" xmlns:cx1="http://schemas.microsoft.com/office/drawing/2015/9/8/chartex" xmlns:cx2="http://schemas.microsoft.com/office/drawing/2015/10/21/chartex" xmlns:cx3="http://schemas.microsoft.com/office/drawing/2016/5/9/chartex" xmlns:cx4="http://schemas.microsoft.com/office/drawing/2016/5/10/chartex" xmlns:cx5="http://schemas.microsoft.com/office/drawing/2016/5/11/chartex" xmlns:cx6="http://schemas.microsoft.com/office/drawing/2016/5/12/chartex" xmlns:cx7="http://schemas.microsoft.com/office/drawing/2016/5/13/chartex" xmlns:cx8="http://schemas.microsoft.com/office/drawing/2016/5/14/chartex" xmlns:mc="http://schemas.openxmlformats.org/markup-compatibility/2006" xmlns:aink="http://schemas.microsoft.com/office/drawing/2016/ink" xmlns:am3d="http://schemas.microsoft.com/office/drawing/2017/model3d" xmlns:o="urn:schemas-microsoft-com:office:office" xmlns:oel="http://schemas.microsoft.com/office/2019/extlst" xmlns:r="http://schemas.openxmlformats.org/officeDocument/2006/relationships" xmlns:m="http://schemas.openxmlformats.org/officeDocument/2006/math" xmlns:v="urn:schemas-microsoft-com:vml" xmlns:wp14="http://schemas.microsoft.com/office/word/2010/wordprocessingDrawing" xmlns:wp="http://schemas.openxmlformats.org/drawingml/2006/wordprocessingDrawing" xmlns:w10="urn:schemas-microsoft-com:office:word" xmlns:w="http://schemas.openxmlformats.org/wordprocessingml/2006/main" xmlns:w14="http://schemas.microsoft.com/office/word/2010/wordml" xmlns:w15="http://schemas.microsoft.com/office/word/2012/wordml" xmlns:w16cex="http://schemas.microsoft.com/office/word/2018/wordml/cex" xmlns:w16cid="http://schemas.microsoft.com/office/word/2016/wordml/cid" xmlns:w16="http://schemas.microsoft.com/office/word/2018/wordml" xmlns:w16du="http://schemas.microsoft.com/office/word/2023/wordml/word16du" xmlns:w16sdtdh="http://schemas.microsoft.com/office/word/2020/wordml/sdtdatahash" xmlns:w16sdtfl="http://schemas.microsoft.com/office/word/2024/wordml/sdtformatlock" xmlns:w16se="http://schemas.microsoft.com/office/word/2015/wordml/symex" xmlns:wpg="http://schemas.microsoft.com/office/word/2010/wordprocessingGroup" xmlns:wpi="http://schemas.microsoft.com/office/word/2010/wordprocessingInk" xmlns:wne="http://schemas.microsoft.com/office/word/2006/wordml" xmlns:wps="http://schemas.microsoft.com/office/word/2010/wordprocessingShape" mc:Ignorable="w14 w15 w16se w16cid w16 w16cex w16sdtdh w16sdtfl w16du wp14">
   <w:p>
     <w:pPr>
       <w:pStyle w:val="Jalus1"/>
@@ -2711,76 +2656,8 @@
 </w:ftr>
 </file>
 
-<file path=word/footer2.xml><?xml version="1.0" encoding="utf-8"?>
-<w:ftr xmlns:wpc="http://schemas.microsoft.com/office/word/2010/wordprocessingCanvas" xmlns:cx="http://schemas.microsoft.com/office/drawing/2014/chartex" xmlns:cx1="http://schemas.microsoft.com/office/drawing/2015/9/8/chartex" xmlns:cx2="http://schemas.microsoft.com/office/drawing/2015/10/21/chartex" xmlns:cx3="http://schemas.microsoft.com/office/drawing/2016/5/9/chartex" xmlns:cx4="http://schemas.microsoft.com/office/drawing/2016/5/10/chartex" xmlns:cx5="http://schemas.microsoft.com/office/drawing/2016/5/11/chartex" xmlns:cx6="http://schemas.microsoft.com/office/drawing/2016/5/12/chartex" xmlns:cx7="http://schemas.microsoft.com/office/drawing/2016/5/13/chartex" xmlns:cx8="http://schemas.microsoft.com/office/drawing/2016/5/14/chartex" xmlns:mc="http://schemas.openxmlformats.org/markup-compatibility/2006" xmlns:aink="http://schemas.microsoft.com/office/drawing/2016/ink" xmlns:am3d="http://schemas.microsoft.com/office/drawing/2017/model3d" xmlns:o="urn:schemas-microsoft-com:office:office" xmlns:oel="http://schemas.microsoft.com/office/2019/extlst" xmlns:r="http://schemas.openxmlformats.org/officeDocument/2006/relationships" xmlns:m="http://schemas.openxmlformats.org/officeDocument/2006/math" xmlns:v="urn:schemas-microsoft-com:vml" xmlns:wp14="http://schemas.microsoft.com/office/word/2010/wordprocessingDrawing" xmlns:wp="http://schemas.openxmlformats.org/drawingml/2006/wordprocessingDrawing" xmlns:w10="urn:schemas-microsoft-com:office:word" xmlns:w="http://schemas.openxmlformats.org/wordprocessingml/2006/main" xmlns:w14="http://schemas.microsoft.com/office/word/2010/wordml" xmlns:w15="http://schemas.microsoft.com/office/word/2012/wordml" xmlns:w16cex="http://schemas.microsoft.com/office/word/2018/wordml/cex" xmlns:w16cid="http://schemas.microsoft.com/office/word/2016/wordml/cid" xmlns:w16="http://schemas.microsoft.com/office/word/2018/wordml" xmlns:w16sdtdh="http://schemas.microsoft.com/office/word/2020/wordml/sdtdatahash" xmlns:w16se="http://schemas.microsoft.com/office/word/2015/wordml/symex" xmlns:wpg="http://schemas.microsoft.com/office/word/2010/wordprocessingGroup" xmlns:wpi="http://schemas.microsoft.com/office/word/2010/wordprocessingInk" xmlns:wne="http://schemas.microsoft.com/office/word/2006/wordml" xmlns:wps="http://schemas.microsoft.com/office/word/2010/wordprocessingShape" mc:Ignorable="w14 w15 w16se w16cid w16 w16cex w16sdtdh wp14">
-  <w:p>
-    <w:pPr>
-      <w:pStyle w:val="Footer"/>
-      <w:rPr>
-        <w:sz w:val="20"/>
-        <w:szCs w:val="20"/>
-      </w:rPr>
-    </w:pPr>
-    <w:r>
-      <w:rPr>
-        <w:sz w:val="20"/>
-        <w:szCs w:val="20"/>
-      </w:rPr>
-      <w:t>Pärnu mnt 139a /</w:t>
-    </w:r>
-    <w:r>
-      <w:rPr>
-        <w:sz w:val="20"/>
-        <w:szCs w:val="20"/>
-      </w:rPr>
-      <w:t xml:space="preserve"> </w:t>
-    </w:r>
-    <w:r>
-      <w:rPr>
-        <w:sz w:val="20"/>
-        <w:szCs w:val="20"/>
-      </w:rPr>
-      <w:t>15169 Tallinn</w:t>
-    </w:r>
-    <w:r>
-      <w:rPr>
-        <w:sz w:val="20"/>
-        <w:szCs w:val="20"/>
-      </w:rPr>
-      <w:t xml:space="preserve"> </w:t>
-    </w:r>
-    <w:r>
-      <w:rPr>
-        <w:sz w:val="20"/>
-        <w:szCs w:val="20"/>
-      </w:rPr>
-      <w:t>/ 663 0200 / ria@ria.ee / www.ria.ee /</w:t>
-    </w:r>
-    <w:r>
-      <w:rPr>
-        <w:sz w:val="20"/>
-        <w:szCs w:val="20"/>
-      </w:rPr>
-      <w:t xml:space="preserve"> </w:t>
-    </w:r>
-  </w:p>
-  <w:p>
-    <w:pPr>
-      <w:pStyle w:val="Footer"/>
-    </w:pPr>
-    <w:r>
-      <w:rPr>
-        <w:sz w:val="20"/>
-        <w:szCs w:val="20"/>
-      </w:rPr>
-      <w:t>registrikood 70006317</w:t>
-    </w:r>
-  </w:p>
-</w:ftr>
-</file>
-
 <file path=word/footnotes.xml><?xml version="1.0" encoding="utf-8"?>
-<w:footnotes xmlns:wpc="http://schemas.microsoft.com/office/word/2010/wordprocessingCanvas" xmlns:cx="http://schemas.microsoft.com/office/drawing/2014/chartex" xmlns:cx1="http://schemas.microsoft.com/office/drawing/2015/9/8/chartex" xmlns:cx2="http://schemas.microsoft.com/office/drawing/2015/10/21/chartex" xmlns:cx3="http://schemas.microsoft.com/office/drawing/2016/5/9/chartex" xmlns:cx4="http://schemas.microsoft.com/office/drawing/2016/5/10/chartex" xmlns:cx5="http://schemas.microsoft.com/office/drawing/2016/5/11/chartex" xmlns:cx6="http://schemas.microsoft.com/office/drawing/2016/5/12/chartex" xmlns:cx7="http://schemas.microsoft.com/office/drawing/2016/5/13/chartex" xmlns:cx8="http://schemas.microsoft.com/office/drawing/2016/5/14/chartex" xmlns:mc="http://schemas.openxmlformats.org/markup-compatibility/2006" xmlns:aink="http://schemas.microsoft.com/office/drawing/2016/ink" xmlns:am3d="http://schemas.microsoft.com/office/drawing/2017/model3d" xmlns:o="urn:schemas-microsoft-com:office:office" xmlns:oel="http://schemas.microsoft.com/office/2019/extlst" xmlns:r="http://schemas.openxmlformats.org/officeDocument/2006/relationships" xmlns:m="http://schemas.openxmlformats.org/officeDocument/2006/math" xmlns:v="urn:schemas-microsoft-com:vml" xmlns:wp14="http://schemas.microsoft.com/office/word/2010/wordprocessingDrawing" xmlns:wp="http://schemas.openxmlformats.org/drawingml/2006/wordprocessingDrawing" xmlns:w10="urn:schemas-microsoft-com:office:word" xmlns:w="http://schemas.openxmlformats.org/wordprocessingml/2006/main" xmlns:w14="http://schemas.microsoft.com/office/word/2010/wordml" xmlns:w15="http://schemas.microsoft.com/office/word/2012/wordml" xmlns:w16cex="http://schemas.microsoft.com/office/word/2018/wordml/cex" xmlns:w16cid="http://schemas.microsoft.com/office/word/2016/wordml/cid" xmlns:w16="http://schemas.microsoft.com/office/word/2018/wordml" xmlns:w16sdtdh="http://schemas.microsoft.com/office/word/2020/wordml/sdtdatahash" xmlns:w16se="http://schemas.microsoft.com/office/word/2015/wordml/symex" xmlns:wpg="http://schemas.microsoft.com/office/word/2010/wordprocessingGroup" xmlns:wpi="http://schemas.microsoft.com/office/word/2010/wordprocessingInk" xmlns:wne="http://schemas.microsoft.com/office/word/2006/wordml" xmlns:wps="http://schemas.microsoft.com/office/word/2010/wordprocessingShape" mc:Ignorable="w14 w15 w16se w16cid w16 w16cex w16sdtdh wp14">
+<w:footnotes xmlns:wpc="http://schemas.microsoft.com/office/word/2010/wordprocessingCanvas" xmlns:cx="http://schemas.microsoft.com/office/drawing/2014/chartex" xmlns:cx1="http://schemas.microsoft.com/office/drawing/2015/9/8/chartex" xmlns:cx2="http://schemas.microsoft.com/office/drawing/2015/10/21/chartex" xmlns:cx3="http://schemas.microsoft.com/office/drawing/2016/5/9/chartex" xmlns:cx4="http://schemas.microsoft.com/office/drawing/2016/5/10/chartex" xmlns:cx5="http://schemas.microsoft.com/office/drawing/2016/5/11/chartex" xmlns:cx6="http://schemas.microsoft.com/office/drawing/2016/5/12/chartex" xmlns:cx7="http://schemas.microsoft.com/office/drawing/2016/5/13/chartex" xmlns:cx8="http://schemas.microsoft.com/office/drawing/2016/5/14/chartex" xmlns:mc="http://schemas.openxmlformats.org/markup-compatibility/2006" xmlns:aink="http://schemas.microsoft.com/office/drawing/2016/ink" xmlns:am3d="http://schemas.microsoft.com/office/drawing/2017/model3d" xmlns:o="urn:schemas-microsoft-com:office:office" xmlns:oel="http://schemas.microsoft.com/office/2019/extlst" xmlns:r="http://schemas.openxmlformats.org/officeDocument/2006/relationships" xmlns:m="http://schemas.openxmlformats.org/officeDocument/2006/math" xmlns:v="urn:schemas-microsoft-com:vml" xmlns:wp14="http://schemas.microsoft.com/office/word/2010/wordprocessingDrawing" xmlns:wp="http://schemas.openxmlformats.org/drawingml/2006/wordprocessingDrawing" xmlns:w10="urn:schemas-microsoft-com:office:word" xmlns:w="http://schemas.openxmlformats.org/wordprocessingml/2006/main" xmlns:w14="http://schemas.microsoft.com/office/word/2010/wordml" xmlns:w15="http://schemas.microsoft.com/office/word/2012/wordml" xmlns:w16cex="http://schemas.microsoft.com/office/word/2018/wordml/cex" xmlns:w16cid="http://schemas.microsoft.com/office/word/2016/wordml/cid" xmlns:w16="http://schemas.microsoft.com/office/word/2018/wordml" xmlns:w16du="http://schemas.microsoft.com/office/word/2023/wordml/word16du" xmlns:w16sdtdh="http://schemas.microsoft.com/office/word/2020/wordml/sdtdatahash" xmlns:w16sdtfl="http://schemas.microsoft.com/office/word/2024/wordml/sdtformatlock" xmlns:w16se="http://schemas.microsoft.com/office/word/2015/wordml/symex" xmlns:wpg="http://schemas.microsoft.com/office/word/2010/wordprocessingGroup" xmlns:wpi="http://schemas.microsoft.com/office/word/2010/wordprocessingInk" xmlns:wne="http://schemas.microsoft.com/office/word/2006/wordml" xmlns:wps="http://schemas.microsoft.com/office/word/2010/wordprocessingShape" mc:Ignorable="w14 w15 w16se w16cid w16 w16cex w16sdtdh w16sdtfl w16du wp14">
   <w:footnote w:type="separator" w:id="-1">
     <w:p>
       <w:pPr>
@@ -2805,7 +2682,7 @@
 </file>
 
 <file path=word/numbering.xml><?xml version="1.0" encoding="utf-8"?>
-<w:numbering xmlns:wpc="http://schemas.microsoft.com/office/word/2010/wordprocessingCanvas" xmlns:cx="http://schemas.microsoft.com/office/drawing/2014/chartex" xmlns:cx1="http://schemas.microsoft.com/office/drawing/2015/9/8/chartex" xmlns:cx2="http://schemas.microsoft.com/office/drawing/2015/10/21/chartex" xmlns:cx3="http://schemas.microsoft.com/office/drawing/2016/5/9/chartex" xmlns:cx4="http://schemas.microsoft.com/office/drawing/2016/5/10/chartex" xmlns:cx5="http://schemas.microsoft.com/office/drawing/2016/5/11/chartex" xmlns:cx6="http://schemas.microsoft.com/office/drawing/2016/5/12/chartex" xmlns:cx7="http://schemas.microsoft.com/office/drawing/2016/5/13/chartex" xmlns:cx8="http://schemas.microsoft.com/office/drawing/2016/5/14/chartex" xmlns:mc="http://schemas.openxmlformats.org/markup-compatibility/2006" xmlns:aink="http://schemas.microsoft.com/office/drawing/2016/ink" xmlns:am3d="http://schemas.microsoft.com/office/drawing/2017/model3d" xmlns:o="urn:schemas-microsoft-com:office:office" xmlns:oel="http://schemas.microsoft.com/office/2019/extlst" xmlns:r="http://schemas.openxmlformats.org/officeDocument/2006/relationships" xmlns:m="http://schemas.openxmlformats.org/officeDocument/2006/math" xmlns:v="urn:schemas-microsoft-com:vml" xmlns:wp14="http://schemas.microsoft.com/office/word/2010/wordprocessingDrawing" xmlns:wp="http://schemas.openxmlformats.org/drawingml/2006/wordprocessingDrawing" xmlns:w10="urn:schemas-microsoft-com:office:word" xmlns:w="http://schemas.openxmlformats.org/wordprocessingml/2006/main" xmlns:w14="http://schemas.microsoft.com/office/word/2010/wordml" xmlns:w15="http://schemas.microsoft.com/office/word/2012/wordml" xmlns:w16cex="http://schemas.microsoft.com/office/word/2018/wordml/cex" xmlns:w16cid="http://schemas.microsoft.com/office/word/2016/wordml/cid" xmlns:w16="http://schemas.microsoft.com/office/word/2018/wordml" xmlns:w16sdtdh="http://schemas.microsoft.com/office/word/2020/wordml/sdtdatahash" xmlns:w16se="http://schemas.microsoft.com/office/word/2015/wordml/symex" xmlns:wpg="http://schemas.microsoft.com/office/word/2010/wordprocessingGroup" xmlns:wpi="http://schemas.microsoft.com/office/word/2010/wordprocessingInk" xmlns:wne="http://schemas.microsoft.com/office/word/2006/wordml" xmlns:wps="http://schemas.microsoft.com/office/word/2010/wordprocessingShape" mc:Ignorable="w14 w15 w16se w16cid w16 w16cex w16sdtdh wp14">
+<w:numbering xmlns:wpc="http://schemas.microsoft.com/office/word/2010/wordprocessingCanvas" xmlns:cx="http://schemas.microsoft.com/office/drawing/2014/chartex" xmlns:cx1="http://schemas.microsoft.com/office/drawing/2015/9/8/chartex" xmlns:cx2="http://schemas.microsoft.com/office/drawing/2015/10/21/chartex" xmlns:cx3="http://schemas.microsoft.com/office/drawing/2016/5/9/chartex" xmlns:cx4="http://schemas.microsoft.com/office/drawing/2016/5/10/chartex" xmlns:cx5="http://schemas.microsoft.com/office/drawing/2016/5/11/chartex" xmlns:cx6="http://schemas.microsoft.com/office/drawing/2016/5/12/chartex" xmlns:cx7="http://schemas.microsoft.com/office/drawing/2016/5/13/chartex" xmlns:cx8="http://schemas.microsoft.com/office/drawing/2016/5/14/chartex" xmlns:mc="http://schemas.openxmlformats.org/markup-compatibility/2006" xmlns:aink="http://schemas.microsoft.com/office/drawing/2016/ink" xmlns:am3d="http://schemas.microsoft.com/office/drawing/2017/model3d" xmlns:o="urn:schemas-microsoft-com:office:office" xmlns:oel="http://schemas.microsoft.com/office/2019/extlst" xmlns:r="http://schemas.openxmlformats.org/officeDocument/2006/relationships" xmlns:m="http://schemas.openxmlformats.org/officeDocument/2006/math" xmlns:v="urn:schemas-microsoft-com:vml" xmlns:wp14="http://schemas.microsoft.com/office/word/2010/wordprocessingDrawing" xmlns:wp="http://schemas.openxmlformats.org/drawingml/2006/wordprocessingDrawing" xmlns:w10="urn:schemas-microsoft-com:office:word" xmlns:w="http://schemas.openxmlformats.org/wordprocessingml/2006/main" xmlns:w14="http://schemas.microsoft.com/office/word/2010/wordml" xmlns:w15="http://schemas.microsoft.com/office/word/2012/wordml" xmlns:w16cex="http://schemas.microsoft.com/office/word/2018/wordml/cex" xmlns:w16cid="http://schemas.microsoft.com/office/word/2016/wordml/cid" xmlns:w16="http://schemas.microsoft.com/office/word/2018/wordml" xmlns:w16du="http://schemas.microsoft.com/office/word/2023/wordml/word16du" xmlns:w16sdtdh="http://schemas.microsoft.com/office/word/2020/wordml/sdtdatahash" xmlns:w16sdtfl="http://schemas.microsoft.com/office/word/2024/wordml/sdtformatlock" xmlns:w16se="http://schemas.microsoft.com/office/word/2015/wordml/symex" xmlns:wpg="http://schemas.microsoft.com/office/word/2010/wordprocessingGroup" xmlns:wpi="http://schemas.microsoft.com/office/word/2010/wordprocessingInk" xmlns:wne="http://schemas.microsoft.com/office/word/2006/wordml" xmlns:wps="http://schemas.microsoft.com/office/word/2010/wordprocessingShape" mc:Ignorable="w14 w15 w16se w16cid w16 w16cex w16sdtdh w16sdtfl w16du wp14">
   <w:abstractNum w:abstractNumId="0" w15:restartNumberingAfterBreak="0">
     <w:nsid w:val="03627A6C"/>
     <w:multiLevelType w:val="hybridMultilevel"/>
@@ -4781,6 +4658,92 @@
     </w:lvl>
   </w:abstractNum>
   <w:abstractNum w:abstractNumId="20" w15:restartNumberingAfterBreak="0">
+    <w:nsid w:val="71EF28B0"/>
+    <w:multiLevelType w:val="hybridMultilevel"/>
+    <w:tmpl w:val="3518529A"/>
+    <w:lvl w:ilvl="0" w:tplc="0425000F">
+      <w:start w:val="1"/>
+      <w:numFmt w:val="decimal"/>
+      <w:lvlText w:val="%1."/>
+      <w:lvlJc w:val="left"/>
+      <w:pPr>
+        <w:ind w:left="720" w:hanging="360"/>
+      </w:pPr>
+    </w:lvl>
+    <w:lvl w:ilvl="1" w:tplc="04250019" w:tentative="1">
+      <w:start w:val="1"/>
+      <w:numFmt w:val="lowerLetter"/>
+      <w:lvlText w:val="%2."/>
+      <w:lvlJc w:val="left"/>
+      <w:pPr>
+        <w:ind w:left="1440" w:hanging="360"/>
+      </w:pPr>
+    </w:lvl>
+    <w:lvl w:ilvl="2" w:tplc="0425001B" w:tentative="1">
+      <w:start w:val="1"/>
+      <w:numFmt w:val="lowerRoman"/>
+      <w:lvlText w:val="%3."/>
+      <w:lvlJc w:val="right"/>
+      <w:pPr>
+        <w:ind w:left="2160" w:hanging="180"/>
+      </w:pPr>
+    </w:lvl>
+    <w:lvl w:ilvl="3" w:tplc="0425000F" w:tentative="1">
+      <w:start w:val="1"/>
+      <w:numFmt w:val="decimal"/>
+      <w:lvlText w:val="%4."/>
+      <w:lvlJc w:val="left"/>
+      <w:pPr>
+        <w:ind w:left="2880" w:hanging="360"/>
+      </w:pPr>
+    </w:lvl>
+    <w:lvl w:ilvl="4" w:tplc="04250019" w:tentative="1">
+      <w:start w:val="1"/>
+      <w:numFmt w:val="lowerLetter"/>
+      <w:lvlText w:val="%5."/>
+      <w:lvlJc w:val="left"/>
+      <w:pPr>
+        <w:ind w:left="3600" w:hanging="360"/>
+      </w:pPr>
+    </w:lvl>
+    <w:lvl w:ilvl="5" w:tplc="0425001B" w:tentative="1">
+      <w:start w:val="1"/>
+      <w:numFmt w:val="lowerRoman"/>
+      <w:lvlText w:val="%6."/>
+      <w:lvlJc w:val="right"/>
+      <w:pPr>
+        <w:ind w:left="4320" w:hanging="180"/>
+      </w:pPr>
+    </w:lvl>
+    <w:lvl w:ilvl="6" w:tplc="0425000F" w:tentative="1">
+      <w:start w:val="1"/>
+      <w:numFmt w:val="decimal"/>
+      <w:lvlText w:val="%7."/>
+      <w:lvlJc w:val="left"/>
+      <w:pPr>
+        <w:ind w:left="5040" w:hanging="360"/>
+      </w:pPr>
+    </w:lvl>
+    <w:lvl w:ilvl="7" w:tplc="04250019" w:tentative="1">
+      <w:start w:val="1"/>
+      <w:numFmt w:val="lowerLetter"/>
+      <w:lvlText w:val="%8."/>
+      <w:lvlJc w:val="left"/>
+      <w:pPr>
+        <w:ind w:left="5760" w:hanging="360"/>
+      </w:pPr>
+    </w:lvl>
+    <w:lvl w:ilvl="8" w:tplc="0425001B" w:tentative="1">
+      <w:start w:val="1"/>
+      <w:numFmt w:val="lowerRoman"/>
+      <w:lvlText w:val="%9."/>
+      <w:lvlJc w:val="right"/>
+      <w:pPr>
+        <w:ind w:left="6480" w:hanging="180"/>
+      </w:pPr>
+    </w:lvl>
+  </w:abstractNum>
+  <w:abstractNum w:abstractNumId="21" w15:restartNumberingAfterBreak="0">
     <w:nsid w:val="7CA802F9"/>
     <w:multiLevelType w:val="hybridMultilevel"/>
     <w:tmpl w:val="76C83F0C"/>
@@ -4951,16 +4914,19 @@
     <w:abstractNumId w:val="1"/>
   </w:num>
   <w:num w:numId="20" w16cid:durableId="1196695451">
-    <w:abstractNumId w:val="20"/>
+    <w:abstractNumId w:val="21"/>
   </w:num>
   <w:num w:numId="21" w16cid:durableId="269557425">
     <w:abstractNumId w:val="16"/>
+  </w:num>
+  <w:num w:numId="22" w16cid:durableId="1112700371">
+    <w:abstractNumId w:val="20"/>
   </w:num>
 </w:numbering>
 </file>
 
 <file path=word/styles.xml><?xml version="1.0" encoding="utf-8"?>
-<w:styles xmlns:mc="http://schemas.openxmlformats.org/markup-compatibility/2006" xmlns:r="http://schemas.openxmlformats.org/officeDocument/2006/relationships" xmlns:w="http://schemas.openxmlformats.org/wordprocessingml/2006/main" xmlns:w14="http://schemas.microsoft.com/office/word/2010/wordml" xmlns:w15="http://schemas.microsoft.com/office/word/2012/wordml" xmlns:w16cex="http://schemas.microsoft.com/office/word/2018/wordml/cex" xmlns:w16cid="http://schemas.microsoft.com/office/word/2016/wordml/cid" xmlns:w16="http://schemas.microsoft.com/office/word/2018/wordml" xmlns:w16sdtdh="http://schemas.microsoft.com/office/word/2020/wordml/sdtdatahash" xmlns:w16se="http://schemas.microsoft.com/office/word/2015/wordml/symex" mc:Ignorable="w14 w15 w16se w16cid w16 w16cex w16sdtdh">
+<w:styles xmlns:mc="http://schemas.openxmlformats.org/markup-compatibility/2006" xmlns:r="http://schemas.openxmlformats.org/officeDocument/2006/relationships" xmlns:w="http://schemas.openxmlformats.org/wordprocessingml/2006/main" xmlns:w14="http://schemas.microsoft.com/office/word/2010/wordml" xmlns:w15="http://schemas.microsoft.com/office/word/2012/wordml" xmlns:w16cex="http://schemas.microsoft.com/office/word/2018/wordml/cex" xmlns:w16cid="http://schemas.microsoft.com/office/word/2016/wordml/cid" xmlns:w16="http://schemas.microsoft.com/office/word/2018/wordml" xmlns:w16du="http://schemas.microsoft.com/office/word/2023/wordml/word16du" xmlns:w16sdtdh="http://schemas.microsoft.com/office/word/2020/wordml/sdtdatahash" xmlns:w16sdtfl="http://schemas.microsoft.com/office/word/2024/wordml/sdtformatlock" xmlns:w16se="http://schemas.microsoft.com/office/word/2015/wordml/symex" mc:Ignorable="w14 w15 w16se w16cid w16 w16cex w16sdtdh w16sdtfl w16du">
   <w:docDefaults>
     <w:rPrDefault>
       <w:rPr>
@@ -5817,6 +5783,18 @@
       <w:u w:val="single"/>
     </w:rPr>
   </w:style>
+  <w:style w:type="character" w:styleId="UnresolvedMention">
+    <w:name w:val="Unresolved Mention"/>
+    <w:basedOn w:val="DefaultParagraphFont"/>
+    <w:uiPriority w:val="99"/>
+    <w:semiHidden/>
+    <w:unhideWhenUsed/>
+    <w:rsid w:val="003A054B"/>
+    <w:rPr>
+      <w:color w:val="605E5C"/>
+      <w:shd w:val="clear" w:color="auto" w:fill="E1DFDD"/>
+    </w:rPr>
+  </w:style>
 </w:styles>
 </file>
 

</xml_diff>